<commit_message>
Complete part of the lab 2 - computer networking
</commit_message>
<xml_diff>
--- a/Computer-Networking/lab-2/姓名 实验2报告 2026.docx
+++ b/Computer-Networking/lab-2/姓名 实验2报告 2026.docx
@@ -4,7 +4,7 @@
   <w:body>
     <w:p>
       <w:pPr>
-        <w:pStyle w:val="1"/>
+        <w:pStyle w:val="Heading1"/>
         <w:spacing w:beforeLines="200" w:before="624" w:afterLines="100" w:after="312"/>
         <w:rPr>
           <w:b/>
@@ -40,7 +40,7 @@
     </w:p>
     <w:tbl>
       <w:tblPr>
-        <w:tblStyle w:val="ac"/>
+        <w:tblStyle w:val="TableGrid"/>
         <w:tblW w:w="0" w:type="auto"/>
         <w:tblBorders>
           <w:top w:val="none" w:sz="0" w:space="0" w:color="auto"/>
@@ -73,14 +73,14 @@
               <w:spacing w:line="520" w:lineRule="exact"/>
               <w:ind w:firstLineChars="0" w:firstLine="0"/>
               <w:rPr>
-                <w:rFonts w:ascii="黑体" w:eastAsia="黑体" w:hAnsi="黑体" w:hint="eastAsia"/>
+                <w:rFonts w:ascii="SimHei" w:eastAsia="SimHei" w:hAnsi="SimHei"/>
                 <w:sz w:val="28"/>
                 <w:szCs w:val="28"/>
               </w:rPr>
             </w:pPr>
             <w:r>
               <w:rPr>
-                <w:rFonts w:ascii="黑体" w:eastAsia="黑体" w:hAnsi="黑体"/>
+                <w:rFonts w:ascii="SimHei" w:eastAsia="SimHei" w:hAnsi="SimHei"/>
                 <w:sz w:val="28"/>
                 <w:szCs w:val="28"/>
               </w:rPr>
@@ -127,7 +127,7 @@
             </w:pPr>
             <w:r>
               <w:rPr>
-                <w:rFonts w:ascii="黑体" w:eastAsia="黑体" w:hAnsi="黑体"/>
+                <w:rFonts w:ascii="SimHei" w:eastAsia="SimHei" w:hAnsi="SimHei"/>
                 <w:sz w:val="28"/>
                 <w:szCs w:val="28"/>
               </w:rPr>
@@ -174,7 +174,7 @@
             </w:pPr>
             <w:r>
               <w:rPr>
-                <w:rFonts w:ascii="黑体" w:eastAsia="黑体" w:hAnsi="黑体"/>
+                <w:rFonts w:ascii="SimHei" w:eastAsia="SimHei" w:hAnsi="SimHei"/>
                 <w:sz w:val="28"/>
                 <w:szCs w:val="28"/>
               </w:rPr>
@@ -326,7 +326,7 @@
     </w:tbl>
     <w:p>
       <w:pPr>
-        <w:pStyle w:val="1"/>
+        <w:pStyle w:val="Heading1"/>
         <w:spacing w:beforeLines="100" w:before="312" w:afterLines="100" w:after="312"/>
         <w:jc w:val="left"/>
         <w:rPr>
@@ -377,7 +377,7 @@
     </w:p>
     <w:p>
       <w:pPr>
-        <w:pStyle w:val="2"/>
+        <w:pStyle w:val="Heading2"/>
         <w:spacing w:before="312" w:after="156"/>
       </w:pPr>
       <w:bookmarkStart w:id="2" w:name="_Toc3460921"/>
@@ -487,7 +487,7 @@
     </w:p>
     <w:p>
       <w:pPr>
-        <w:pStyle w:val="2"/>
+        <w:pStyle w:val="Heading2"/>
         <w:snapToGrid w:val="0"/>
         <w:spacing w:before="312" w:after="156"/>
       </w:pPr>
@@ -652,7 +652,7 @@
     </w:p>
     <w:p>
       <w:pPr>
-        <w:pStyle w:val="2"/>
+        <w:pStyle w:val="Heading2"/>
         <w:snapToGrid w:val="0"/>
         <w:spacing w:before="312" w:after="156"/>
       </w:pPr>
@@ -676,7 +676,7 @@
     </w:p>
     <w:p>
       <w:pPr>
-        <w:pStyle w:val="2"/>
+        <w:pStyle w:val="Heading2"/>
         <w:snapToGrid w:val="0"/>
         <w:spacing w:before="312" w:after="156"/>
       </w:pPr>
@@ -700,7 +700,7 @@
     </w:p>
     <w:p>
       <w:pPr>
-        <w:pStyle w:val="2"/>
+        <w:pStyle w:val="Heading2"/>
         <w:snapToGrid w:val="0"/>
         <w:spacing w:before="312" w:after="156"/>
       </w:pPr>
@@ -714,7 +714,7 @@
     </w:p>
     <w:p>
       <w:pPr>
-        <w:pStyle w:val="3"/>
+        <w:pStyle w:val="Heading3"/>
         <w:numPr>
           <w:ilvl w:val="2"/>
           <w:numId w:val="9"/>
@@ -843,7 +843,7 @@
     </w:p>
     <w:tbl>
       <w:tblPr>
-        <w:tblStyle w:val="ac"/>
+        <w:tblStyle w:val="TableGrid"/>
         <w:tblW w:w="0" w:type="auto"/>
         <w:tblInd w:w="421" w:type="dxa"/>
         <w:tblLook w:val="04A0" w:firstRow="1" w:lastRow="0" w:firstColumn="1" w:lastColumn="0" w:noHBand="0" w:noVBand="1"/>
@@ -1105,9 +1105,14 @@
       <w:r>
         <w:t xml:space="preserve">dns.qry.name contains </w:t>
       </w:r>
-      <w:r>
-        <w:t>www.baidu.com</w:t>
-      </w:r>
+      <w:hyperlink r:id="rId7" w:history="1">
+        <w:r>
+          <w:rPr>
+            <w:rStyle w:val="Hyperlink"/>
+          </w:rPr>
+          <w:t>www.baidu.com</w:t>
+        </w:r>
+      </w:hyperlink>
       <w:r>
         <w:rPr>
           <w:rFonts w:hint="eastAsia"/>
@@ -1119,6 +1124,55 @@
           <w:rFonts w:hint="eastAsia"/>
         </w:rPr>
         <w:t>。</w:t>
+      </w:r>
+    </w:p>
+    <w:p>
+      <w:pPr>
+        <w:ind w:firstLineChars="0" w:firstLine="0"/>
+        <w:jc w:val="center"/>
+      </w:pPr>
+      <w:r>
+        <w:drawing>
+          <wp:inline distT="0" distB="0" distL="0" distR="0" wp14:anchorId="1CC663E6" wp14:editId="5DB289E3">
+            <wp:extent cx="5808747" cy="2987040"/>
+            <wp:effectExtent l="0" t="0" r="0" b="0"/>
+            <wp:docPr id="377317361" name="Picture 1"/>
+            <wp:cNvGraphicFramePr>
+              <a:graphicFrameLocks xmlns:a="http://schemas.openxmlformats.org/drawingml/2006/main" noChangeAspect="1"/>
+            </wp:cNvGraphicFramePr>
+            <a:graphic xmlns:a="http://schemas.openxmlformats.org/drawingml/2006/main">
+              <a:graphicData uri="http://schemas.openxmlformats.org/drawingml/2006/picture">
+                <pic:pic xmlns:pic="http://schemas.openxmlformats.org/drawingml/2006/picture">
+                  <pic:nvPicPr>
+                    <pic:cNvPr id="377317361" name="Picture 1"/>
+                    <pic:cNvPicPr/>
+                  </pic:nvPicPr>
+                  <pic:blipFill>
+                    <a:blip r:embed="rId8" cstate="print">
+                      <a:extLst>
+                        <a:ext uri="{28A0092B-C50C-407E-A947-70E740481C1C}">
+                          <a14:useLocalDpi xmlns:a14="http://schemas.microsoft.com/office/drawing/2010/main" val="0"/>
+                        </a:ext>
+                      </a:extLst>
+                    </a:blip>
+                    <a:stretch>
+                      <a:fillRect/>
+                    </a:stretch>
+                  </pic:blipFill>
+                  <pic:spPr>
+                    <a:xfrm>
+                      <a:off x="0" y="0"/>
+                      <a:ext cx="5900626" cy="3034287"/>
+                    </a:xfrm>
+                    <a:prstGeom prst="rect">
+                      <a:avLst/>
+                    </a:prstGeom>
+                  </pic:spPr>
+                </pic:pic>
+              </a:graphicData>
+            </a:graphic>
+          </wp:inline>
+        </w:drawing>
       </w:r>
     </w:p>
     <w:p>
@@ -1166,7 +1220,7 @@
     </w:p>
     <w:tbl>
       <w:tblPr>
-        <w:tblStyle w:val="ac"/>
+        <w:tblStyle w:val="TableGrid"/>
         <w:tblW w:w="0" w:type="auto"/>
         <w:tblInd w:w="421" w:type="dxa"/>
         <w:tblLook w:val="04A0" w:firstRow="1" w:lastRow="0" w:firstColumn="1" w:lastColumn="0" w:noHBand="0" w:noVBand="1"/>
@@ -1184,42 +1238,42 @@
             <w:pPr>
               <w:ind w:firstLineChars="0" w:firstLine="0"/>
               <w:rPr>
-                <w:rFonts w:eastAsia="宋体"/>
-              </w:rPr>
-            </w:pPr>
-            <w:r>
-              <w:rPr>
-                <w:rFonts w:eastAsia="宋体" w:hint="eastAsia"/>
+                <w:rFonts w:eastAsia="SimSun"/>
+              </w:rPr>
+            </w:pPr>
+            <w:r>
+              <w:rPr>
+                <w:rFonts w:eastAsia="SimSun" w:hint="eastAsia"/>
               </w:rPr>
               <w:t>传输层协议</w:t>
             </w:r>
             <w:r>
               <w:rPr>
-                <w:rFonts w:eastAsia="宋体" w:hint="eastAsia"/>
+                <w:rFonts w:eastAsia="SimSun" w:hint="eastAsia"/>
               </w:rPr>
               <w:t>（</w:t>
             </w:r>
             <w:r>
               <w:rPr>
-                <w:rFonts w:eastAsia="宋体" w:hint="eastAsia"/>
+                <w:rFonts w:eastAsia="SimSun" w:hint="eastAsia"/>
               </w:rPr>
               <w:t>UDP</w:t>
             </w:r>
             <w:r>
               <w:rPr>
-                <w:rFonts w:eastAsia="宋体" w:hint="eastAsia"/>
+                <w:rFonts w:eastAsia="SimSun" w:hint="eastAsia"/>
               </w:rPr>
               <w:t>还是</w:t>
             </w:r>
             <w:r>
               <w:rPr>
-                <w:rFonts w:eastAsia="宋体" w:hint="eastAsia"/>
+                <w:rFonts w:eastAsia="SimSun" w:hint="eastAsia"/>
               </w:rPr>
               <w:t>TCP</w:t>
             </w:r>
             <w:r>
               <w:rPr>
-                <w:rFonts w:eastAsia="宋体" w:hint="eastAsia"/>
+                <w:rFonts w:eastAsia="SimSun" w:hint="eastAsia"/>
               </w:rPr>
               <w:t>？）</w:t>
             </w:r>
@@ -1233,9 +1287,15 @@
             <w:pPr>
               <w:ind w:firstLineChars="0" w:firstLine="0"/>
               <w:rPr>
-                <w:b/>
-              </w:rPr>
-            </w:pPr>
+                <w:bCs/>
+              </w:rPr>
+            </w:pPr>
+            <w:r>
+              <w:rPr>
+                <w:bCs/>
+              </w:rPr>
+              <w:t>UDP</w:t>
+            </w:r>
           </w:p>
         </w:tc>
       </w:tr>
@@ -1248,12 +1308,12 @@
             <w:pPr>
               <w:ind w:firstLineChars="0" w:firstLine="0"/>
               <w:rPr>
-                <w:rFonts w:eastAsia="宋体"/>
-              </w:rPr>
-            </w:pPr>
-            <w:r>
-              <w:rPr>
-                <w:rFonts w:eastAsia="宋体" w:hint="eastAsia"/>
+                <w:rFonts w:eastAsia="SimSun"/>
+              </w:rPr>
+            </w:pPr>
+            <w:r>
+              <w:rPr>
+                <w:rFonts w:eastAsia="SimSun" w:hint="eastAsia"/>
               </w:rPr>
               <w:t>目的地址</w:t>
             </w:r>
@@ -1270,6 +1330,12 @@
                 <w:b/>
               </w:rPr>
             </w:pPr>
+            <w:r>
+              <w:rPr>
+                <w:b/>
+              </w:rPr>
+              <w:t>202.117.0.20</w:t>
+            </w:r>
           </w:p>
         </w:tc>
       </w:tr>
@@ -1282,12 +1348,12 @@
             <w:pPr>
               <w:ind w:firstLineChars="0" w:firstLine="0"/>
               <w:rPr>
-                <w:rFonts w:eastAsia="宋体"/>
-              </w:rPr>
-            </w:pPr>
-            <w:r>
-              <w:rPr>
-                <w:rFonts w:eastAsia="宋体" w:hint="eastAsia"/>
+                <w:rFonts w:eastAsia="SimSun"/>
+              </w:rPr>
+            </w:pPr>
+            <w:r>
+              <w:rPr>
+                <w:rFonts w:eastAsia="SimSun" w:hint="eastAsia"/>
               </w:rPr>
               <w:t>目的端口</w:t>
             </w:r>
@@ -1304,6 +1370,12 @@
                 <w:b/>
               </w:rPr>
             </w:pPr>
+            <w:r>
+              <w:rPr>
+                <w:b/>
+              </w:rPr>
+              <w:t>53</w:t>
+            </w:r>
           </w:p>
         </w:tc>
       </w:tr>
@@ -1316,12 +1388,12 @@
             <w:pPr>
               <w:ind w:firstLineChars="0" w:firstLine="0"/>
               <w:rPr>
-                <w:rFonts w:eastAsia="宋体"/>
-              </w:rPr>
-            </w:pPr>
-            <w:r>
-              <w:rPr>
-                <w:rFonts w:eastAsia="宋体" w:hint="eastAsia"/>
+                <w:rFonts w:eastAsia="SimSun"/>
+              </w:rPr>
+            </w:pPr>
+            <w:r>
+              <w:rPr>
+                <w:rFonts w:eastAsia="SimSun" w:hint="eastAsia"/>
               </w:rPr>
               <w:t>域名解析记录类型</w:t>
             </w:r>
@@ -1338,6 +1410,13 @@
                 <w:b/>
               </w:rPr>
             </w:pPr>
+            <w:r>
+              <w:rPr>
+                <w:rFonts w:hint="eastAsia"/>
+                <w:b/>
+              </w:rPr>
+              <w:t>A</w:t>
+            </w:r>
           </w:p>
         </w:tc>
       </w:tr>
@@ -1350,12 +1429,12 @@
             <w:pPr>
               <w:ind w:firstLineChars="0" w:firstLine="0"/>
               <w:rPr>
-                <w:rFonts w:eastAsia="宋体"/>
-              </w:rPr>
-            </w:pPr>
-            <w:r>
-              <w:rPr>
-                <w:rFonts w:eastAsia="宋体" w:hint="eastAsia"/>
+                <w:rFonts w:eastAsia="SimSun"/>
+              </w:rPr>
+            </w:pPr>
+            <w:r>
+              <w:rPr>
+                <w:rFonts w:eastAsia="SimSun" w:hint="eastAsia"/>
               </w:rPr>
               <w:t>解析的名字</w:t>
             </w:r>
@@ -1372,6 +1451,12 @@
                 <w:b/>
               </w:rPr>
             </w:pPr>
+            <w:r>
+              <w:rPr>
+                <w:b/>
+              </w:rPr>
+              <w:t>www.baidu.com</w:t>
+            </w:r>
           </w:p>
         </w:tc>
       </w:tr>
@@ -1392,6 +1477,7 @@
         <w:rPr>
           <w:rFonts w:hint="eastAsia"/>
         </w:rPr>
+        <w:lastRenderedPageBreak/>
         <w:t>2.</w:t>
       </w:r>
       <w:r>
@@ -1458,8 +1544,51 @@
     </w:p>
     <w:p>
       <w:pPr>
-        <w:ind w:firstLine="480"/>
-      </w:pPr>
+        <w:ind w:firstLineChars="0" w:firstLine="0"/>
+      </w:pPr>
+      <w:r>
+        <w:drawing>
+          <wp:inline distT="0" distB="0" distL="0" distR="0" wp14:anchorId="4F4F00D6" wp14:editId="50D02F47">
+            <wp:extent cx="5134115" cy="5342255"/>
+            <wp:effectExtent l="0" t="0" r="0" b="4445"/>
+            <wp:docPr id="690185685" name="Picture 1"/>
+            <wp:cNvGraphicFramePr>
+              <a:graphicFrameLocks xmlns:a="http://schemas.openxmlformats.org/drawingml/2006/main" noChangeAspect="1"/>
+            </wp:cNvGraphicFramePr>
+            <a:graphic xmlns:a="http://schemas.openxmlformats.org/drawingml/2006/main">
+              <a:graphicData uri="http://schemas.openxmlformats.org/drawingml/2006/picture">
+                <pic:pic xmlns:pic="http://schemas.openxmlformats.org/drawingml/2006/picture">
+                  <pic:nvPicPr>
+                    <pic:cNvPr id="690185685" name="Picture 1"/>
+                    <pic:cNvPicPr/>
+                  </pic:nvPicPr>
+                  <pic:blipFill>
+                    <a:blip r:embed="rId9" cstate="print">
+                      <a:extLst>
+                        <a:ext uri="{28A0092B-C50C-407E-A947-70E740481C1C}">
+                          <a14:useLocalDpi xmlns:a14="http://schemas.microsoft.com/office/drawing/2010/main" val="0"/>
+                        </a:ext>
+                      </a:extLst>
+                    </a:blip>
+                    <a:stretch>
+                      <a:fillRect/>
+                    </a:stretch>
+                  </pic:blipFill>
+                  <pic:spPr>
+                    <a:xfrm>
+                      <a:off x="0" y="0"/>
+                      <a:ext cx="5134115" cy="5342255"/>
+                    </a:xfrm>
+                    <a:prstGeom prst="rect">
+                      <a:avLst/>
+                    </a:prstGeom>
+                  </pic:spPr>
+                </pic:pic>
+              </a:graphicData>
+            </a:graphic>
+          </wp:inline>
+        </w:drawing>
+      </w:r>
     </w:p>
     <w:p>
       <w:pPr>
@@ -1492,7 +1621,7 @@
     </w:p>
     <w:tbl>
       <w:tblPr>
-        <w:tblStyle w:val="ac"/>
+        <w:tblStyle w:val="TableGrid"/>
         <w:tblW w:w="0" w:type="auto"/>
         <w:tblInd w:w="421" w:type="dxa"/>
         <w:tblLook w:val="04A0" w:firstRow="1" w:lastRow="0" w:firstColumn="1" w:lastColumn="0" w:noHBand="0" w:noVBand="1"/>
@@ -1510,24 +1639,24 @@
             <w:pPr>
               <w:ind w:firstLineChars="0" w:firstLine="0"/>
               <w:rPr>
-                <w:rFonts w:eastAsia="宋体"/>
-              </w:rPr>
-            </w:pPr>
-            <w:r>
-              <w:rPr>
-                <w:rFonts w:eastAsia="宋体" w:hint="eastAsia"/>
+                <w:rFonts w:eastAsia="SimSun"/>
+              </w:rPr>
+            </w:pPr>
+            <w:r>
+              <w:rPr>
+                <w:rFonts w:eastAsia="SimSun" w:hint="eastAsia"/>
               </w:rPr>
               <w:t>有几条</w:t>
             </w:r>
             <w:r>
               <w:rPr>
-                <w:rFonts w:eastAsia="宋体" w:hint="eastAsia"/>
+                <w:rFonts w:eastAsia="SimSun" w:hint="eastAsia"/>
               </w:rPr>
               <w:t>Answers</w:t>
             </w:r>
             <w:r>
               <w:rPr>
-                <w:rFonts w:eastAsia="宋体" w:hint="eastAsia"/>
+                <w:rFonts w:eastAsia="SimSun" w:hint="eastAsia"/>
               </w:rPr>
               <w:t>记录</w:t>
             </w:r>
@@ -1541,9 +1670,17 @@
             <w:pPr>
               <w:ind w:firstLineChars="0" w:firstLine="0"/>
               <w:rPr>
+                <w:rFonts w:hint="eastAsia"/>
                 <w:b/>
               </w:rPr>
             </w:pPr>
+            <w:r>
+              <w:rPr>
+                <w:rFonts w:hint="eastAsia"/>
+                <w:b/>
+              </w:rPr>
+              <w:t>3</w:t>
+            </w:r>
           </w:p>
         </w:tc>
       </w:tr>
@@ -1556,30 +1693,30 @@
             <w:pPr>
               <w:ind w:firstLineChars="0" w:firstLine="0"/>
               <w:rPr>
-                <w:rFonts w:eastAsia="宋体"/>
-              </w:rPr>
-            </w:pPr>
-            <w:r>
-              <w:rPr>
-                <w:rFonts w:eastAsia="宋体" w:hint="eastAsia"/>
+                <w:rFonts w:eastAsia="SimSun"/>
+              </w:rPr>
+            </w:pPr>
+            <w:r>
+              <w:rPr>
+                <w:rFonts w:eastAsia="SimSun" w:hint="eastAsia"/>
               </w:rPr>
               <w:t>有几条</w:t>
             </w:r>
             <w:r>
               <w:rPr>
-                <w:rFonts w:eastAsia="宋体"/>
+                <w:rFonts w:eastAsia="SimSun"/>
               </w:rPr>
               <w:t>Authorit</w:t>
             </w:r>
             <w:r>
               <w:rPr>
-                <w:rFonts w:eastAsia="宋体" w:hint="eastAsia"/>
+                <w:rFonts w:eastAsia="SimSun" w:hint="eastAsia"/>
               </w:rPr>
               <w:t>ative NS</w:t>
             </w:r>
             <w:r>
               <w:rPr>
-                <w:rFonts w:eastAsia="宋体" w:hint="eastAsia"/>
+                <w:rFonts w:eastAsia="SimSun" w:hint="eastAsia"/>
               </w:rPr>
               <w:t>记录</w:t>
             </w:r>
@@ -1593,9 +1730,17 @@
             <w:pPr>
               <w:ind w:firstLineChars="0" w:firstLine="0"/>
               <w:rPr>
+                <w:rFonts w:hint="eastAsia"/>
                 <w:b/>
               </w:rPr>
             </w:pPr>
+            <w:r>
+              <w:rPr>
+                <w:rFonts w:hint="eastAsia"/>
+                <w:b/>
+              </w:rPr>
+              <w:t>5</w:t>
+            </w:r>
           </w:p>
         </w:tc>
       </w:tr>
@@ -1608,24 +1753,24 @@
             <w:pPr>
               <w:ind w:firstLineChars="0" w:firstLine="0"/>
               <w:rPr>
-                <w:rFonts w:eastAsia="宋体"/>
-              </w:rPr>
-            </w:pPr>
-            <w:r>
-              <w:rPr>
-                <w:rFonts w:eastAsia="宋体" w:hint="eastAsia"/>
+                <w:rFonts w:eastAsia="SimSun"/>
+              </w:rPr>
+            </w:pPr>
+            <w:r>
+              <w:rPr>
+                <w:rFonts w:eastAsia="SimSun" w:hint="eastAsia"/>
               </w:rPr>
               <w:t>有几条</w:t>
             </w:r>
             <w:r>
               <w:rPr>
-                <w:rFonts w:eastAsia="宋体" w:hint="eastAsia"/>
+                <w:rFonts w:eastAsia="SimSun" w:hint="eastAsia"/>
               </w:rPr>
               <w:t>Additional</w:t>
             </w:r>
             <w:r>
               <w:rPr>
-                <w:rFonts w:eastAsia="宋体" w:hint="eastAsia"/>
+                <w:rFonts w:eastAsia="SimSun" w:hint="eastAsia"/>
               </w:rPr>
               <w:t>记录</w:t>
             </w:r>
@@ -1639,9 +1784,17 @@
             <w:pPr>
               <w:ind w:firstLineChars="0" w:firstLine="0"/>
               <w:rPr>
+                <w:rFonts w:hint="eastAsia"/>
                 <w:b/>
               </w:rPr>
             </w:pPr>
+            <w:r>
+              <w:rPr>
+                <w:rFonts w:hint="eastAsia"/>
+                <w:b/>
+              </w:rPr>
+              <w:t>9</w:t>
+            </w:r>
           </w:p>
         </w:tc>
       </w:tr>
@@ -1707,14 +1860,7 @@
           <w:rFonts w:hint="eastAsia"/>
           <w:b/>
         </w:rPr>
-        <w:t>域名解析</w:t>
-      </w:r>
-      <w:r>
-        <w:rPr>
-          <w:rFonts w:hint="eastAsia"/>
-          <w:b/>
-        </w:rPr>
-        <w:t>。</w:t>
+        <w:t>域名解析。</w:t>
       </w:r>
       <w:r>
         <w:rPr>
@@ -1950,10 +2096,9 @@
         <w:rPr>
           <w:rFonts w:hint="eastAsia"/>
         </w:rPr>
-        <w:lastRenderedPageBreak/>
         <w:t xml:space="preserve">3.1 </w:t>
       </w:r>
-      <w:hyperlink r:id="rId7" w:history="1">
+      <w:hyperlink r:id="rId10" w:history="1">
         <w:r>
           <w:rPr>
             <w:rFonts w:hint="eastAsia"/>
@@ -1982,38 +2127,103 @@
     </w:p>
     <w:p>
       <w:pPr>
+        <w:ind w:firstLineChars="0" w:firstLine="0"/>
+        <w:jc w:val="left"/>
+      </w:pPr>
+      <w:r>
+        <w:lastRenderedPageBreak/>
+        <w:drawing>
+          <wp:inline distT="0" distB="0" distL="0" distR="0" wp14:anchorId="344F1CD1" wp14:editId="641420F6">
+            <wp:extent cx="5274310" cy="1632878"/>
+            <wp:effectExtent l="0" t="0" r="0" b="5715"/>
+            <wp:docPr id="743500994" name="Picture 1"/>
+            <wp:cNvGraphicFramePr>
+              <a:graphicFrameLocks xmlns:a="http://schemas.openxmlformats.org/drawingml/2006/main" noChangeAspect="1"/>
+            </wp:cNvGraphicFramePr>
+            <a:graphic xmlns:a="http://schemas.openxmlformats.org/drawingml/2006/main">
+              <a:graphicData uri="http://schemas.openxmlformats.org/drawingml/2006/picture">
+                <pic:pic xmlns:pic="http://schemas.openxmlformats.org/drawingml/2006/picture">
+                  <pic:nvPicPr>
+                    <pic:cNvPr id="743500994" name="Picture 1"/>
+                    <pic:cNvPicPr/>
+                  </pic:nvPicPr>
+                  <pic:blipFill>
+                    <a:blip r:embed="rId11" cstate="print">
+                      <a:extLst>
+                        <a:ext uri="{28A0092B-C50C-407E-A947-70E740481C1C}">
+                          <a14:useLocalDpi xmlns:a14="http://schemas.microsoft.com/office/drawing/2010/main" val="0"/>
+                        </a:ext>
+                      </a:extLst>
+                    </a:blip>
+                    <a:stretch>
+                      <a:fillRect/>
+                    </a:stretch>
+                  </pic:blipFill>
+                  <pic:spPr>
+                    <a:xfrm>
+                      <a:off x="0" y="0"/>
+                      <a:ext cx="5274310" cy="1632878"/>
+                    </a:xfrm>
+                    <a:prstGeom prst="rect">
+                      <a:avLst/>
+                    </a:prstGeom>
+                  </pic:spPr>
+                </pic:pic>
+              </a:graphicData>
+            </a:graphic>
+          </wp:inline>
+        </w:drawing>
+      </w:r>
+      <w:r>
+        <w:t xml:space="preserve"> </w:t>
+      </w:r>
+    </w:p>
+    <w:p>
+      <w:pPr>
         <w:ind w:firstLine="480"/>
         <w:jc w:val="left"/>
       </w:pPr>
+      <w:r>
+        <w:rPr>
+          <w:rFonts w:hint="eastAsia"/>
+        </w:rPr>
+        <w:t xml:space="preserve">3.2 </w:t>
+      </w:r>
+      <w:r>
+        <w:rPr>
+          <w:rFonts w:hint="eastAsia"/>
+        </w:rPr>
+        <w:t>说明相关的</w:t>
+      </w:r>
+      <w:r>
+        <w:rPr>
+          <w:rFonts w:hint="eastAsia"/>
+        </w:rPr>
+        <w:t>DNS</w:t>
+      </w:r>
+      <w:r>
+        <w:rPr>
+          <w:rFonts w:hint="eastAsia"/>
+        </w:rPr>
+        <w:t>报文有几条？</w:t>
+      </w:r>
     </w:p>
     <w:p>
       <w:pPr>
         <w:ind w:firstLine="480"/>
         <w:jc w:val="left"/>
-      </w:pPr>
-      <w:r>
-        <w:rPr>
-          <w:rFonts w:hint="eastAsia"/>
-        </w:rPr>
-        <w:t xml:space="preserve">3.2 </w:t>
-      </w:r>
-      <w:r>
-        <w:rPr>
-          <w:rFonts w:hint="eastAsia"/>
-        </w:rPr>
-        <w:t>说明相关的</w:t>
-      </w:r>
-      <w:r>
-        <w:rPr>
-          <w:rFonts w:hint="eastAsia"/>
-        </w:rPr>
-        <w:t>DNS</w:t>
-      </w:r>
-      <w:r>
-        <w:rPr>
-          <w:rFonts w:hint="eastAsia"/>
-        </w:rPr>
-        <w:t>报文有几条？</w:t>
+        <w:rPr>
+          <w:rFonts w:hint="eastAsia"/>
+        </w:rPr>
+      </w:pPr>
+      <w:r>
+        <w:t>2</w:t>
+      </w:r>
+      <w:r>
+        <w:rPr>
+          <w:rFonts w:hint="eastAsia"/>
+        </w:rPr>
+        <w:t>条</w:t>
       </w:r>
     </w:p>
     <w:p>
@@ -2062,14 +2272,14 @@
     </w:p>
     <w:tbl>
       <w:tblPr>
-        <w:tblStyle w:val="ac"/>
+        <w:tblStyle w:val="TableGrid"/>
         <w:tblW w:w="0" w:type="auto"/>
         <w:tblInd w:w="421" w:type="dxa"/>
         <w:tblLook w:val="04A0" w:firstRow="1" w:lastRow="0" w:firstColumn="1" w:lastColumn="0" w:noHBand="0" w:noVBand="1"/>
       </w:tblPr>
       <w:tblGrid>
         <w:gridCol w:w="4252"/>
-        <w:gridCol w:w="3119"/>
+        <w:gridCol w:w="3479"/>
       </w:tblGrid>
       <w:tr>
         <w:tc>
@@ -2080,48 +2290,48 @@
             <w:pPr>
               <w:ind w:firstLineChars="0" w:firstLine="0"/>
               <w:rPr>
-                <w:rFonts w:eastAsia="宋体"/>
-              </w:rPr>
-            </w:pPr>
-            <w:r>
-              <w:rPr>
-                <w:rFonts w:eastAsia="宋体" w:hint="eastAsia"/>
+                <w:rFonts w:eastAsia="SimSun"/>
+              </w:rPr>
+            </w:pPr>
+            <w:r>
+              <w:rPr>
+                <w:rFonts w:eastAsia="SimSun" w:hint="eastAsia"/>
               </w:rPr>
               <w:t>DNS</w:t>
             </w:r>
             <w:r>
               <w:rPr>
-                <w:rFonts w:eastAsia="宋体" w:hint="eastAsia"/>
+                <w:rFonts w:eastAsia="SimSun" w:hint="eastAsia"/>
               </w:rPr>
               <w:t>服务器</w:t>
             </w:r>
             <w:r>
               <w:rPr>
-                <w:rFonts w:eastAsia="宋体" w:hint="eastAsia"/>
+                <w:rFonts w:eastAsia="SimSun" w:hint="eastAsia"/>
               </w:rPr>
               <w:t>地址与本机默认</w:t>
             </w:r>
             <w:r>
               <w:rPr>
-                <w:rFonts w:eastAsia="宋体" w:hint="eastAsia"/>
+                <w:rFonts w:eastAsia="SimSun" w:hint="eastAsia"/>
               </w:rPr>
               <w:t>DNS</w:t>
             </w:r>
             <w:r>
               <w:rPr>
-                <w:rFonts w:eastAsia="宋体" w:hint="eastAsia"/>
+                <w:rFonts w:eastAsia="SimSun" w:hint="eastAsia"/>
               </w:rPr>
               <w:t>服务器地址</w:t>
             </w:r>
             <w:r>
               <w:rPr>
-                <w:rFonts w:eastAsia="宋体" w:hint="eastAsia"/>
+                <w:rFonts w:eastAsia="SimSun" w:hint="eastAsia"/>
               </w:rPr>
               <w:t>是否相同</w:t>
             </w:r>
             <w:r>
               <w:rPr>
-                <w:rFonts w:eastAsia="宋体" w:hint="eastAsia"/>
+                <w:rFonts w:eastAsia="SimSun" w:hint="eastAsia"/>
               </w:rPr>
               <w:t>？</w:t>
             </w:r>
@@ -2135,9 +2345,17 @@
             <w:pPr>
               <w:ind w:firstLineChars="0" w:firstLine="0"/>
               <w:rPr>
+                <w:rFonts w:hint="eastAsia"/>
                 <w:b/>
               </w:rPr>
             </w:pPr>
+            <w:r>
+              <w:rPr>
+                <w:rFonts w:hint="eastAsia"/>
+                <w:b/>
+              </w:rPr>
+              <w:t>不同</w:t>
+            </w:r>
           </w:p>
         </w:tc>
       </w:tr>
@@ -2150,18 +2368,18 @@
             <w:pPr>
               <w:ind w:firstLineChars="0" w:firstLine="0"/>
               <w:rPr>
-                <w:rFonts w:eastAsia="宋体"/>
-              </w:rPr>
-            </w:pPr>
-            <w:r>
-              <w:rPr>
-                <w:rFonts w:eastAsia="宋体" w:hint="eastAsia"/>
+                <w:rFonts w:eastAsia="SimSun"/>
+              </w:rPr>
+            </w:pPr>
+            <w:r>
+              <w:rPr>
+                <w:rFonts w:eastAsia="SimSun" w:hint="eastAsia"/>
               </w:rPr>
               <w:t>有没有</w:t>
             </w:r>
             <w:r>
               <w:rPr>
-                <w:rFonts w:eastAsia="宋体" w:hint="eastAsia"/>
+                <w:rFonts w:eastAsia="SimSun" w:hint="eastAsia"/>
                 <w:b/>
                 <w:bCs/>
               </w:rPr>
@@ -2169,19 +2387,19 @@
             </w:r>
             <w:r>
               <w:rPr>
-                <w:rFonts w:eastAsia="宋体" w:hint="eastAsia"/>
+                <w:rFonts w:eastAsia="SimSun" w:hint="eastAsia"/>
               </w:rPr>
               <w:t>类型的</w:t>
             </w:r>
             <w:r>
               <w:rPr>
-                <w:rFonts w:eastAsia="宋体" w:hint="eastAsia"/>
+                <w:rFonts w:eastAsia="SimSun" w:hint="eastAsia"/>
               </w:rPr>
               <w:t>域名解析</w:t>
             </w:r>
             <w:r>
               <w:rPr>
-                <w:rFonts w:eastAsia="宋体" w:hint="eastAsia"/>
+                <w:rFonts w:eastAsia="SimSun" w:hint="eastAsia"/>
               </w:rPr>
               <w:t>报文？</w:t>
             </w:r>
@@ -2195,9 +2413,17 @@
             <w:pPr>
               <w:ind w:firstLineChars="0" w:firstLine="0"/>
               <w:rPr>
+                <w:rFonts w:hint="eastAsia"/>
                 <w:b/>
               </w:rPr>
             </w:pPr>
+            <w:r>
+              <w:rPr>
+                <w:rFonts w:hint="eastAsia"/>
+                <w:b/>
+              </w:rPr>
+              <w:t>没有</w:t>
+            </w:r>
           </w:p>
         </w:tc>
       </w:tr>
@@ -2210,7 +2436,7 @@
             <w:pPr>
               <w:ind w:firstLineChars="0" w:firstLine="0"/>
               <w:rPr>
-                <w:rFonts w:eastAsia="宋体"/>
+                <w:rFonts w:eastAsia="SimSun"/>
               </w:rPr>
             </w:pPr>
             <w:r>
@@ -2237,13 +2463,13 @@
             </w:r>
             <w:r>
               <w:rPr>
-                <w:rFonts w:eastAsia="宋体" w:hint="eastAsia"/>
+                <w:rFonts w:eastAsia="SimSun" w:hint="eastAsia"/>
               </w:rPr>
               <w:t>的</w:t>
             </w:r>
             <w:r>
               <w:rPr>
-                <w:rFonts w:eastAsia="宋体" w:hint="eastAsia"/>
+                <w:rFonts w:eastAsia="SimSun" w:hint="eastAsia"/>
               </w:rPr>
               <w:t>真实名字是什么？</w:t>
             </w:r>
@@ -2257,9 +2483,16 @@
             <w:pPr>
               <w:ind w:firstLineChars="0" w:firstLine="0"/>
               <w:rPr>
+                <w:rFonts w:hint="eastAsia"/>
                 <w:b/>
               </w:rPr>
             </w:pPr>
+            <w:r>
+              <w:rPr>
+                <w:b/>
+              </w:rPr>
+              <w:t>d2iwv1xxkqpmiz.cloudfront.net</w:t>
+            </w:r>
           </w:p>
         </w:tc>
       </w:tr>
@@ -2278,19 +2511,19 @@
             </w:pPr>
             <w:r>
               <w:rPr>
-                <w:rFonts w:eastAsia="宋体" w:hint="eastAsia"/>
+                <w:rFonts w:eastAsia="SimSun" w:hint="eastAsia"/>
               </w:rPr>
               <w:t>其对应的</w:t>
             </w:r>
             <w:r>
               <w:rPr>
-                <w:rFonts w:eastAsia="宋体" w:hint="eastAsia"/>
+                <w:rFonts w:eastAsia="SimSun" w:hint="eastAsia"/>
               </w:rPr>
               <w:t>IPv4</w:t>
             </w:r>
             <w:r>
               <w:rPr>
-                <w:rFonts w:eastAsia="宋体" w:hint="eastAsia"/>
+                <w:rFonts w:eastAsia="SimSun" w:hint="eastAsia"/>
               </w:rPr>
               <w:t>地址有几个？</w:t>
             </w:r>
@@ -2304,9 +2537,24 @@
             <w:pPr>
               <w:ind w:firstLineChars="0" w:firstLine="0"/>
               <w:rPr>
+                <w:rFonts w:hint="eastAsia"/>
                 <w:b/>
               </w:rPr>
             </w:pPr>
+            <w:r>
+              <w:rPr>
+                <w:rFonts w:hint="eastAsia"/>
+                <w:b/>
+              </w:rPr>
+              <w:t>4</w:t>
+            </w:r>
+            <w:r>
+              <w:rPr>
+                <w:rFonts w:hint="eastAsia"/>
+                <w:b/>
+              </w:rPr>
+              <w:t>个</w:t>
+            </w:r>
           </w:p>
         </w:tc>
       </w:tr>
@@ -2326,7 +2574,7 @@
     </w:p>
     <w:p>
       <w:pPr>
-        <w:pStyle w:val="3"/>
+        <w:pStyle w:val="Heading3"/>
         <w:numPr>
           <w:ilvl w:val="2"/>
           <w:numId w:val="9"/>
@@ -2602,7 +2850,13 @@
         <w:rPr>
           <w:rFonts w:hint="eastAsia"/>
         </w:rPr>
-        <w:t>贴图（</w:t>
+        <w:t>贴图</w:t>
+      </w:r>
+      <w:r>
+        <w:rPr>
+          <w:rFonts w:hint="eastAsia"/>
+        </w:rPr>
+        <w:t>（</w:t>
       </w:r>
       <w:r>
         <w:fldChar w:fldCharType="end"/>
@@ -2647,37 +2901,37 @@
         <w:ind w:firstLine="480"/>
         <w:jc w:val="center"/>
         <w:rPr>
-          <w:rFonts w:eastAsia="楷体"/>
-        </w:rPr>
-      </w:pPr>
-      <w:r>
-        <w:rPr>
-          <w:rFonts w:eastAsia="楷体" w:hint="eastAsia"/>
+          <w:rFonts w:eastAsia="KaiTi"/>
+        </w:rPr>
+      </w:pPr>
+      <w:r>
+        <w:rPr>
+          <w:rFonts w:eastAsia="KaiTi" w:hint="eastAsia"/>
         </w:rPr>
         <w:t>无缓存情况下</w:t>
       </w:r>
       <w:r>
         <w:rPr>
-          <w:rFonts w:eastAsia="楷体" w:hint="eastAsia"/>
+          <w:rFonts w:eastAsia="KaiTi" w:hint="eastAsia"/>
         </w:rPr>
         <w:t>不同网站访问</w:t>
       </w:r>
       <w:r>
         <w:rPr>
-          <w:rFonts w:eastAsia="楷体" w:hint="eastAsia"/>
+          <w:rFonts w:eastAsia="KaiTi" w:hint="eastAsia"/>
         </w:rPr>
         <w:t>情况统计</w:t>
       </w:r>
       <w:r>
         <w:rPr>
-          <w:rFonts w:eastAsia="楷体" w:hint="eastAsia"/>
+          <w:rFonts w:eastAsia="KaiTi" w:hint="eastAsia"/>
         </w:rPr>
         <w:t>表</w:t>
       </w:r>
     </w:p>
     <w:tbl>
       <w:tblPr>
-        <w:tblStyle w:val="ac"/>
+        <w:tblStyle w:val="TableGrid"/>
         <w:tblW w:w="8369" w:type="dxa"/>
         <w:jc w:val="center"/>
         <w:tblLook w:val="04A0" w:firstRow="1" w:lastRow="0" w:firstColumn="1" w:lastColumn="0" w:noHBand="0" w:noVBand="1"/>
@@ -2710,13 +2964,13 @@
               <w:ind w:firstLineChars="0" w:firstLine="0"/>
               <w:jc w:val="center"/>
               <w:rPr>
-                <w:rFonts w:eastAsia="黑体"/>
-                <w:szCs w:val="24"/>
-              </w:rPr>
-            </w:pPr>
-            <w:r>
-              <w:rPr>
-                <w:rFonts w:eastAsia="黑体" w:hint="eastAsia"/>
+                <w:rFonts w:eastAsia="SimHei"/>
+                <w:szCs w:val="24"/>
+              </w:rPr>
+            </w:pPr>
+            <w:r>
+              <w:rPr>
+                <w:rFonts w:eastAsia="SimHei" w:hint="eastAsia"/>
                 <w:szCs w:val="24"/>
               </w:rPr>
               <w:t>访问网站</w:t>
@@ -2740,13 +2994,13 @@
               <w:ind w:firstLineChars="0" w:firstLine="0"/>
               <w:jc w:val="center"/>
               <w:rPr>
-                <w:rFonts w:ascii="黑体" w:eastAsia="黑体" w:hAnsi="黑体" w:hint="eastAsia"/>
-                <w:szCs w:val="24"/>
-              </w:rPr>
-            </w:pPr>
-            <w:r>
-              <w:rPr>
-                <w:rFonts w:ascii="黑体" w:eastAsia="黑体" w:hAnsi="黑体" w:hint="eastAsia"/>
+                <w:rFonts w:ascii="SimHei" w:eastAsia="SimHei" w:hAnsi="SimHei"/>
+                <w:szCs w:val="24"/>
+              </w:rPr>
+            </w:pPr>
+            <w:r>
+              <w:rPr>
+                <w:rFonts w:ascii="SimHei" w:eastAsia="SimHei" w:hAnsi="SimHei" w:hint="eastAsia"/>
                 <w:szCs w:val="24"/>
               </w:rPr>
               <w:t>国内</w:t>
@@ -2770,13 +3024,13 @@
               <w:ind w:firstLineChars="0" w:firstLine="0"/>
               <w:jc w:val="center"/>
               <w:rPr>
-                <w:rFonts w:ascii="黑体" w:eastAsia="黑体" w:hAnsi="黑体" w:hint="eastAsia"/>
-                <w:szCs w:val="24"/>
-              </w:rPr>
-            </w:pPr>
-            <w:r>
-              <w:rPr>
-                <w:rFonts w:ascii="黑体" w:eastAsia="黑体" w:hAnsi="黑体" w:hint="eastAsia"/>
+                <w:rFonts w:ascii="SimHei" w:eastAsia="SimHei" w:hAnsi="SimHei"/>
+                <w:szCs w:val="24"/>
+              </w:rPr>
+            </w:pPr>
+            <w:r>
+              <w:rPr>
+                <w:rFonts w:ascii="SimHei" w:eastAsia="SimHei" w:hAnsi="SimHei" w:hint="eastAsia"/>
                 <w:szCs w:val="24"/>
               </w:rPr>
               <w:t>国外</w:t>
@@ -2800,13 +3054,13 @@
               <w:ind w:firstLineChars="0" w:firstLine="0"/>
               <w:jc w:val="center"/>
               <w:rPr>
-                <w:rFonts w:ascii="黑体" w:eastAsia="黑体" w:hAnsi="黑体" w:hint="eastAsia"/>
-                <w:szCs w:val="24"/>
-              </w:rPr>
-            </w:pPr>
-            <w:r>
-              <w:rPr>
-                <w:rFonts w:ascii="黑体" w:eastAsia="黑体" w:hAnsi="黑体" w:hint="eastAsia"/>
+                <w:rFonts w:ascii="SimHei" w:eastAsia="SimHei" w:hAnsi="SimHei"/>
+                <w:szCs w:val="24"/>
+              </w:rPr>
+            </w:pPr>
+            <w:r>
+              <w:rPr>
+                <w:rFonts w:ascii="SimHei" w:eastAsia="SimHei" w:hAnsi="SimHei" w:hint="eastAsia"/>
                 <w:szCs w:val="24"/>
               </w:rPr>
               <w:t>南半球</w:t>
@@ -2835,13 +3089,13 @@
               <w:ind w:firstLineChars="0" w:firstLine="0"/>
               <w:jc w:val="center"/>
               <w:rPr>
-                <w:rFonts w:eastAsia="黑体"/>
-                <w:szCs w:val="24"/>
-              </w:rPr>
-            </w:pPr>
-            <w:r>
-              <w:rPr>
-                <w:rFonts w:eastAsia="黑体" w:hint="eastAsia"/>
+                <w:rFonts w:eastAsia="SimHei"/>
+                <w:szCs w:val="24"/>
+              </w:rPr>
+            </w:pPr>
+            <w:r>
+              <w:rPr>
+                <w:rFonts w:eastAsia="SimHei" w:hint="eastAsia"/>
                 <w:szCs w:val="24"/>
               </w:rPr>
               <w:t>域名</w:t>
@@ -2868,7 +3122,7 @@
               <w:rPr>
                 <w:rFonts w:eastAsia="仿宋"/>
                 <w:i/>
-                <w:color w:val="FF0000"/>
+                <w:color w:val="EE0000"/>
                 <w:szCs w:val="24"/>
               </w:rPr>
             </w:pPr>
@@ -2942,20 +3196,20 @@
               <w:ind w:firstLineChars="0" w:firstLine="0"/>
               <w:jc w:val="center"/>
               <w:rPr>
-                <w:rFonts w:eastAsia="黑体"/>
-                <w:szCs w:val="24"/>
-              </w:rPr>
-            </w:pPr>
-            <w:r>
-              <w:rPr>
-                <w:rFonts w:eastAsia="黑体"/>
+                <w:rFonts w:eastAsia="SimHei"/>
+                <w:szCs w:val="24"/>
+              </w:rPr>
+            </w:pPr>
+            <w:r>
+              <w:rPr>
+                <w:rFonts w:eastAsia="SimHei"/>
                 <w:szCs w:val="24"/>
               </w:rPr>
               <w:t>IP</w:t>
             </w:r>
             <w:r>
               <w:rPr>
-                <w:rFonts w:eastAsia="黑体" w:hint="eastAsia"/>
+                <w:rFonts w:eastAsia="SimHei" w:hint="eastAsia"/>
                 <w:szCs w:val="24"/>
               </w:rPr>
               <w:t>地址</w:t>
@@ -3049,13 +3303,13 @@
               <w:ind w:firstLineChars="0" w:firstLine="0"/>
               <w:jc w:val="center"/>
               <w:rPr>
-                <w:rFonts w:eastAsia="黑体"/>
-                <w:szCs w:val="24"/>
-              </w:rPr>
-            </w:pPr>
-            <w:r>
-              <w:rPr>
-                <w:rFonts w:eastAsia="黑体" w:hint="eastAsia"/>
+                <w:rFonts w:eastAsia="SimHei"/>
+                <w:szCs w:val="24"/>
+              </w:rPr>
+            </w:pPr>
+            <w:r>
+              <w:rPr>
+                <w:rFonts w:eastAsia="SimHei" w:hint="eastAsia"/>
                 <w:szCs w:val="24"/>
                 <w:highlight w:val="yellow"/>
               </w:rPr>
@@ -3133,20 +3387,20 @@
               <w:ind w:firstLineChars="0" w:firstLine="0"/>
               <w:jc w:val="center"/>
               <w:rPr>
-                <w:rFonts w:eastAsia="黑体"/>
-                <w:szCs w:val="24"/>
-              </w:rPr>
-            </w:pPr>
-            <w:r>
-              <w:rPr>
-                <w:rFonts w:eastAsia="黑体"/>
+                <w:rFonts w:eastAsia="SimHei"/>
+                <w:szCs w:val="24"/>
+              </w:rPr>
+            </w:pPr>
+            <w:r>
+              <w:rPr>
+                <w:rFonts w:eastAsia="SimHei"/>
                 <w:szCs w:val="24"/>
               </w:rPr>
               <w:t>DNS</w:t>
             </w:r>
             <w:r>
               <w:rPr>
-                <w:rFonts w:eastAsia="黑体" w:hint="eastAsia"/>
+                <w:rFonts w:eastAsia="SimHei" w:hint="eastAsia"/>
                 <w:szCs w:val="24"/>
               </w:rPr>
               <w:t>次数</w:t>
@@ -3241,55 +3495,56 @@
               <w:ind w:firstLineChars="0" w:firstLine="0"/>
               <w:jc w:val="center"/>
               <w:rPr>
-                <w:rFonts w:eastAsia="黑体"/>
-                <w:szCs w:val="24"/>
-              </w:rPr>
-            </w:pPr>
-            <w:r>
-              <w:rPr>
-                <w:rFonts w:eastAsia="黑体" w:hint="eastAsia"/>
+                <w:rFonts w:eastAsia="SimHei"/>
+                <w:szCs w:val="24"/>
+              </w:rPr>
+            </w:pPr>
+            <w:r>
+              <w:rPr>
+                <w:rFonts w:eastAsia="SimHei" w:hint="eastAsia"/>
                 <w:szCs w:val="24"/>
               </w:rPr>
               <w:t>第</w:t>
             </w:r>
             <w:r>
               <w:rPr>
-                <w:rFonts w:eastAsia="黑体" w:hint="eastAsia"/>
+                <w:rFonts w:eastAsia="SimHei" w:hint="eastAsia"/>
                 <w:szCs w:val="24"/>
               </w:rPr>
               <w:t>1</w:t>
             </w:r>
             <w:r>
               <w:rPr>
-                <w:rFonts w:eastAsia="黑体" w:hint="eastAsia"/>
+                <w:rFonts w:eastAsia="SimHei" w:hint="eastAsia"/>
                 <w:szCs w:val="24"/>
               </w:rPr>
               <w:t>个</w:t>
             </w:r>
             <w:r>
               <w:rPr>
-                <w:rFonts w:eastAsia="黑体" w:hint="eastAsia"/>
+                <w:rFonts w:eastAsia="SimHei" w:hint="eastAsia"/>
                 <w:szCs w:val="24"/>
               </w:rPr>
               <w:t>DNS</w:t>
             </w:r>
             <w:r>
               <w:rPr>
-                <w:rFonts w:eastAsia="黑体" w:hint="eastAsia"/>
+                <w:rFonts w:eastAsia="SimHei" w:hint="eastAsia"/>
                 <w:szCs w:val="24"/>
               </w:rPr>
               <w:t>请求的</w:t>
             </w:r>
             <w:r>
               <w:rPr>
-                <w:rFonts w:eastAsia="黑体" w:hint="eastAsia"/>
-                <w:szCs w:val="24"/>
-              </w:rPr>
+                <w:rFonts w:eastAsia="SimHei" w:hint="eastAsia"/>
+                <w:szCs w:val="24"/>
+              </w:rPr>
+              <w:lastRenderedPageBreak/>
               <w:t>应答时间</w:t>
             </w:r>
             <w:r>
               <w:rPr>
-                <w:rFonts w:eastAsia="黑体"/>
+                <w:rFonts w:eastAsia="SimHei"/>
                 <w:szCs w:val="24"/>
               </w:rPr>
               <w:t>(</w:t>
@@ -3297,14 +3552,14 @@
             <w:proofErr w:type="spellStart"/>
             <w:r>
               <w:rPr>
-                <w:rFonts w:eastAsia="黑体" w:hint="eastAsia"/>
+                <w:rFonts w:eastAsia="SimHei" w:hint="eastAsia"/>
                 <w:szCs w:val="24"/>
               </w:rPr>
               <w:t>m</w:t>
             </w:r>
             <w:r>
               <w:rPr>
-                <w:rFonts w:eastAsia="黑体"/>
+                <w:rFonts w:eastAsia="SimHei"/>
                 <w:szCs w:val="24"/>
               </w:rPr>
               <w:t>s</w:t>
@@ -3312,7 +3567,7 @@
             <w:proofErr w:type="spellEnd"/>
             <w:r>
               <w:rPr>
-                <w:rFonts w:eastAsia="黑体"/>
+                <w:rFonts w:eastAsia="SimHei"/>
                 <w:szCs w:val="24"/>
               </w:rPr>
               <w:t>)</w:t>
@@ -3407,27 +3662,27 @@
               <w:ind w:firstLineChars="0" w:firstLine="0"/>
               <w:jc w:val="center"/>
               <w:rPr>
-                <w:rFonts w:eastAsia="黑体"/>
-                <w:szCs w:val="24"/>
-              </w:rPr>
-            </w:pPr>
-            <w:r>
-              <w:rPr>
-                <w:rFonts w:eastAsia="黑体" w:hint="eastAsia"/>
+                <w:rFonts w:eastAsia="SimHei"/>
+                <w:szCs w:val="24"/>
+              </w:rPr>
+            </w:pPr>
+            <w:r>
+              <w:rPr>
+                <w:rFonts w:eastAsia="SimHei" w:hint="eastAsia"/>
                 <w:szCs w:val="24"/>
               </w:rPr>
               <w:t>页面的</w:t>
             </w:r>
             <w:r>
               <w:rPr>
-                <w:rFonts w:eastAsia="黑体" w:hint="eastAsia"/>
+                <w:rFonts w:eastAsia="SimHei" w:hint="eastAsia"/>
                 <w:szCs w:val="24"/>
               </w:rPr>
               <w:t>加载时间</w:t>
             </w:r>
             <w:r>
               <w:rPr>
-                <w:rFonts w:eastAsia="黑体"/>
+                <w:rFonts w:eastAsia="SimHei"/>
                 <w:szCs w:val="24"/>
               </w:rPr>
               <w:t>(</w:t>
@@ -3435,14 +3690,14 @@
             <w:proofErr w:type="spellStart"/>
             <w:r>
               <w:rPr>
-                <w:rFonts w:eastAsia="黑体" w:hint="eastAsia"/>
+                <w:rFonts w:eastAsia="SimHei" w:hint="eastAsia"/>
                 <w:szCs w:val="24"/>
               </w:rPr>
               <w:t>m</w:t>
             </w:r>
             <w:r>
               <w:rPr>
-                <w:rFonts w:eastAsia="黑体"/>
+                <w:rFonts w:eastAsia="SimHei"/>
                 <w:szCs w:val="24"/>
               </w:rPr>
               <w:t>s</w:t>
@@ -3450,7 +3705,7 @@
             <w:proofErr w:type="spellEnd"/>
             <w:r>
               <w:rPr>
-                <w:rFonts w:eastAsia="黑体"/>
+                <w:rFonts w:eastAsia="SimHei"/>
                 <w:szCs w:val="24"/>
               </w:rPr>
               <w:t>)</w:t>
@@ -3545,20 +3800,20 @@
               <w:ind w:firstLineChars="0" w:firstLine="0"/>
               <w:jc w:val="center"/>
               <w:rPr>
-                <w:rFonts w:eastAsia="黑体"/>
-                <w:szCs w:val="24"/>
-              </w:rPr>
-            </w:pPr>
-            <w:r>
-              <w:rPr>
-                <w:rFonts w:eastAsia="黑体" w:hint="eastAsia"/>
+                <w:rFonts w:eastAsia="SimHei"/>
+                <w:szCs w:val="24"/>
+              </w:rPr>
+            </w:pPr>
+            <w:r>
+              <w:rPr>
+                <w:rFonts w:eastAsia="SimHei" w:hint="eastAsia"/>
                 <w:szCs w:val="24"/>
               </w:rPr>
               <w:t>HTTP</w:t>
             </w:r>
             <w:r>
               <w:rPr>
-                <w:rFonts w:eastAsia="黑体" w:hint="eastAsia"/>
+                <w:rFonts w:eastAsia="SimHei" w:hint="eastAsia"/>
                 <w:szCs w:val="24"/>
               </w:rPr>
               <w:t>建立连接数</w:t>
@@ -3653,13 +3908,13 @@
               <w:ind w:firstLineChars="0" w:firstLine="0"/>
               <w:jc w:val="center"/>
               <w:rPr>
-                <w:rFonts w:eastAsia="黑体"/>
-                <w:szCs w:val="24"/>
-              </w:rPr>
-            </w:pPr>
-            <w:r>
-              <w:rPr>
-                <w:rFonts w:eastAsia="黑体" w:hint="eastAsia"/>
+                <w:rFonts w:eastAsia="SimHei"/>
+                <w:szCs w:val="24"/>
+              </w:rPr>
+            </w:pPr>
+            <w:r>
+              <w:rPr>
+                <w:rFonts w:eastAsia="SimHei" w:hint="eastAsia"/>
                 <w:szCs w:val="24"/>
               </w:rPr>
               <w:t>请求对象数</w:t>
@@ -3848,7 +4103,6 @@
         <w:rPr>
           <w:rFonts w:hint="eastAsia"/>
         </w:rPr>
-        <w:lastRenderedPageBreak/>
         <w:t xml:space="preserve">4.4 </w:t>
       </w:r>
       <w:r>
@@ -3875,7 +4129,7 @@
         </w:rPr>
         <w:t>报文，</w:t>
       </w:r>
-      <w:hyperlink r:id="rId8" w:history="1">
+      <w:hyperlink r:id="rId12" w:history="1">
         <w:r>
           <w:rPr>
             <w:rFonts w:hint="eastAsia"/>
@@ -3899,16 +4153,8 @@
         <w:rPr>
           <w:rFonts w:hint="eastAsia"/>
         </w:rPr>
-        <w:t>“分组列表</w:t>
-      </w:r>
-      <w:proofErr w:type="gramStart"/>
-      <w:r>
-        <w:rPr>
-          <w:rFonts w:hint="eastAsia"/>
-        </w:rPr>
-        <w:t>”</w:t>
-      </w:r>
-      <w:proofErr w:type="gramEnd"/>
+        <w:t>“分组列表”</w:t>
+      </w:r>
       <w:r>
         <w:rPr>
           <w:rFonts w:hint="eastAsia"/>
@@ -4041,14 +4287,14 @@
       </w:r>
       <w:r>
         <w:rPr>
-          <w:rFonts w:eastAsia="黑体" w:hint="eastAsia"/>
+          <w:rFonts w:eastAsia="SimHei" w:hint="eastAsia"/>
           <w:szCs w:val="24"/>
         </w:rPr>
         <w:t>页面的加载时间</w:t>
       </w:r>
       <w:r>
         <w:rPr>
-          <w:rFonts w:eastAsia="黑体"/>
+          <w:rFonts w:eastAsia="SimHei"/>
           <w:szCs w:val="24"/>
         </w:rPr>
         <w:t>(</w:t>
@@ -4056,14 +4302,14 @@
       <w:proofErr w:type="spellStart"/>
       <w:r>
         <w:rPr>
-          <w:rFonts w:eastAsia="黑体" w:hint="eastAsia"/>
+          <w:rFonts w:eastAsia="SimHei" w:hint="eastAsia"/>
           <w:szCs w:val="24"/>
         </w:rPr>
         <w:t>m</w:t>
       </w:r>
       <w:r>
         <w:rPr>
-          <w:rFonts w:eastAsia="黑体"/>
+          <w:rFonts w:eastAsia="SimHei"/>
           <w:szCs w:val="24"/>
         </w:rPr>
         <w:t>s</w:t>
@@ -4071,14 +4317,14 @@
       <w:proofErr w:type="spellEnd"/>
       <w:r>
         <w:rPr>
-          <w:rFonts w:eastAsia="黑体"/>
+          <w:rFonts w:eastAsia="SimHei"/>
           <w:szCs w:val="24"/>
         </w:rPr>
         <w:t>)</w:t>
       </w:r>
       <w:r>
         <w:rPr>
-          <w:rFonts w:eastAsia="黑体" w:hint="eastAsia"/>
+          <w:rFonts w:eastAsia="SimHei" w:hint="eastAsia"/>
           <w:szCs w:val="24"/>
         </w:rPr>
         <w:t>”</w:t>
@@ -4314,19 +4560,19 @@
         <w:ind w:firstLine="480"/>
         <w:jc w:val="center"/>
         <w:rPr>
-          <w:rFonts w:eastAsia="楷体"/>
-        </w:rPr>
-      </w:pPr>
-      <w:r>
-        <w:rPr>
-          <w:rFonts w:eastAsia="楷体" w:hint="eastAsia"/>
+          <w:rFonts w:eastAsia="KaiTi"/>
+        </w:rPr>
+      </w:pPr>
+      <w:r>
+        <w:rPr>
+          <w:rFonts w:eastAsia="KaiTi" w:hint="eastAsia"/>
         </w:rPr>
         <w:t>带缓存情况下不同网站访问情况统计表</w:t>
       </w:r>
     </w:p>
     <w:tbl>
       <w:tblPr>
-        <w:tblStyle w:val="ac"/>
+        <w:tblStyle w:val="TableGrid"/>
         <w:tblW w:w="8369" w:type="dxa"/>
         <w:jc w:val="center"/>
         <w:tblLook w:val="04A0" w:firstRow="1" w:lastRow="0" w:firstColumn="1" w:lastColumn="0" w:noHBand="0" w:noVBand="1"/>
@@ -4359,13 +4605,13 @@
               <w:ind w:firstLineChars="0" w:firstLine="0"/>
               <w:jc w:val="center"/>
               <w:rPr>
-                <w:rFonts w:eastAsia="黑体"/>
-                <w:szCs w:val="24"/>
-              </w:rPr>
-            </w:pPr>
-            <w:r>
-              <w:rPr>
-                <w:rFonts w:eastAsia="黑体" w:hint="eastAsia"/>
+                <w:rFonts w:eastAsia="SimHei"/>
+                <w:szCs w:val="24"/>
+              </w:rPr>
+            </w:pPr>
+            <w:r>
+              <w:rPr>
+                <w:rFonts w:eastAsia="SimHei" w:hint="eastAsia"/>
                 <w:szCs w:val="24"/>
               </w:rPr>
               <w:t>访问网站</w:t>
@@ -4389,13 +4635,13 @@
               <w:ind w:firstLineChars="0" w:firstLine="0"/>
               <w:jc w:val="center"/>
               <w:rPr>
-                <w:rFonts w:ascii="黑体" w:eastAsia="黑体" w:hAnsi="黑体" w:hint="eastAsia"/>
-                <w:szCs w:val="24"/>
-              </w:rPr>
-            </w:pPr>
-            <w:r>
-              <w:rPr>
-                <w:rFonts w:ascii="黑体" w:eastAsia="黑体" w:hAnsi="黑体" w:hint="eastAsia"/>
+                <w:rFonts w:ascii="SimHei" w:eastAsia="SimHei" w:hAnsi="SimHei"/>
+                <w:szCs w:val="24"/>
+              </w:rPr>
+            </w:pPr>
+            <w:r>
+              <w:rPr>
+                <w:rFonts w:ascii="SimHei" w:eastAsia="SimHei" w:hAnsi="SimHei" w:hint="eastAsia"/>
                 <w:szCs w:val="24"/>
               </w:rPr>
               <w:t>国内</w:t>
@@ -4419,13 +4665,13 @@
               <w:ind w:firstLineChars="0" w:firstLine="0"/>
               <w:jc w:val="center"/>
               <w:rPr>
-                <w:rFonts w:ascii="黑体" w:eastAsia="黑体" w:hAnsi="黑体" w:hint="eastAsia"/>
-                <w:szCs w:val="24"/>
-              </w:rPr>
-            </w:pPr>
-            <w:r>
-              <w:rPr>
-                <w:rFonts w:ascii="黑体" w:eastAsia="黑体" w:hAnsi="黑体" w:hint="eastAsia"/>
+                <w:rFonts w:ascii="SimHei" w:eastAsia="SimHei" w:hAnsi="SimHei"/>
+                <w:szCs w:val="24"/>
+              </w:rPr>
+            </w:pPr>
+            <w:r>
+              <w:rPr>
+                <w:rFonts w:ascii="SimHei" w:eastAsia="SimHei" w:hAnsi="SimHei" w:hint="eastAsia"/>
                 <w:szCs w:val="24"/>
               </w:rPr>
               <w:t>国外</w:t>
@@ -4449,13 +4695,13 @@
               <w:ind w:firstLineChars="0" w:firstLine="0"/>
               <w:jc w:val="center"/>
               <w:rPr>
-                <w:rFonts w:ascii="黑体" w:eastAsia="黑体" w:hAnsi="黑体" w:hint="eastAsia"/>
-                <w:szCs w:val="24"/>
-              </w:rPr>
-            </w:pPr>
-            <w:r>
-              <w:rPr>
-                <w:rFonts w:ascii="黑体" w:eastAsia="黑体" w:hAnsi="黑体" w:hint="eastAsia"/>
+                <w:rFonts w:ascii="SimHei" w:eastAsia="SimHei" w:hAnsi="SimHei"/>
+                <w:szCs w:val="24"/>
+              </w:rPr>
+            </w:pPr>
+            <w:r>
+              <w:rPr>
+                <w:rFonts w:ascii="SimHei" w:eastAsia="SimHei" w:hAnsi="SimHei" w:hint="eastAsia"/>
                 <w:szCs w:val="24"/>
               </w:rPr>
               <w:t>南半球</w:t>
@@ -4484,13 +4730,13 @@
               <w:ind w:firstLineChars="0" w:firstLine="0"/>
               <w:jc w:val="center"/>
               <w:rPr>
-                <w:rFonts w:eastAsia="黑体"/>
-                <w:szCs w:val="24"/>
-              </w:rPr>
-            </w:pPr>
-            <w:r>
-              <w:rPr>
-                <w:rFonts w:eastAsia="黑体" w:hint="eastAsia"/>
+                <w:rFonts w:eastAsia="SimHei"/>
+                <w:szCs w:val="24"/>
+              </w:rPr>
+            </w:pPr>
+            <w:r>
+              <w:rPr>
+                <w:rFonts w:eastAsia="SimHei" w:hint="eastAsia"/>
                 <w:szCs w:val="24"/>
               </w:rPr>
               <w:t>域名</w:t>
@@ -4591,20 +4837,20 @@
               <w:ind w:firstLineChars="0" w:firstLine="0"/>
               <w:jc w:val="center"/>
               <w:rPr>
-                <w:rFonts w:eastAsia="黑体"/>
-                <w:szCs w:val="24"/>
-              </w:rPr>
-            </w:pPr>
-            <w:r>
-              <w:rPr>
-                <w:rFonts w:eastAsia="黑体"/>
+                <w:rFonts w:eastAsia="SimHei"/>
+                <w:szCs w:val="24"/>
+              </w:rPr>
+            </w:pPr>
+            <w:r>
+              <w:rPr>
+                <w:rFonts w:eastAsia="SimHei"/>
                 <w:szCs w:val="24"/>
               </w:rPr>
               <w:t>IP</w:t>
             </w:r>
             <w:r>
               <w:rPr>
-                <w:rFonts w:eastAsia="黑体" w:hint="eastAsia"/>
+                <w:rFonts w:eastAsia="SimHei" w:hint="eastAsia"/>
                 <w:szCs w:val="24"/>
               </w:rPr>
               <w:t>地址</w:t>
@@ -4698,13 +4944,13 @@
               <w:ind w:firstLineChars="0" w:firstLine="0"/>
               <w:jc w:val="center"/>
               <w:rPr>
-                <w:rFonts w:eastAsia="黑体"/>
-                <w:szCs w:val="24"/>
-              </w:rPr>
-            </w:pPr>
-            <w:r>
-              <w:rPr>
-                <w:rFonts w:eastAsia="黑体" w:hint="eastAsia"/>
+                <w:rFonts w:eastAsia="SimHei"/>
+                <w:szCs w:val="24"/>
+              </w:rPr>
+            </w:pPr>
+            <w:r>
+              <w:rPr>
+                <w:rFonts w:eastAsia="SimHei" w:hint="eastAsia"/>
                 <w:szCs w:val="24"/>
                 <w:highlight w:val="yellow"/>
               </w:rPr>
@@ -4782,20 +5028,20 @@
               <w:ind w:firstLineChars="0" w:firstLine="0"/>
               <w:jc w:val="center"/>
               <w:rPr>
-                <w:rFonts w:eastAsia="黑体"/>
-                <w:szCs w:val="24"/>
-              </w:rPr>
-            </w:pPr>
-            <w:r>
-              <w:rPr>
-                <w:rFonts w:eastAsia="黑体"/>
+                <w:rFonts w:eastAsia="SimHei"/>
+                <w:szCs w:val="24"/>
+              </w:rPr>
+            </w:pPr>
+            <w:r>
+              <w:rPr>
+                <w:rFonts w:eastAsia="SimHei"/>
                 <w:szCs w:val="24"/>
               </w:rPr>
               <w:t>DNS</w:t>
             </w:r>
             <w:r>
               <w:rPr>
-                <w:rFonts w:eastAsia="黑体" w:hint="eastAsia"/>
+                <w:rFonts w:eastAsia="SimHei" w:hint="eastAsia"/>
                 <w:szCs w:val="24"/>
               </w:rPr>
               <w:t>次数</w:t>
@@ -4890,20 +5136,20 @@
               <w:ind w:firstLineChars="0" w:firstLine="0"/>
               <w:jc w:val="center"/>
               <w:rPr>
-                <w:rFonts w:eastAsia="黑体"/>
-                <w:szCs w:val="24"/>
-              </w:rPr>
-            </w:pPr>
-            <w:r>
-              <w:rPr>
-                <w:rFonts w:eastAsia="黑体" w:hint="eastAsia"/>
+                <w:rFonts w:eastAsia="SimHei"/>
+                <w:szCs w:val="24"/>
+              </w:rPr>
+            </w:pPr>
+            <w:r>
+              <w:rPr>
+                <w:rFonts w:eastAsia="SimHei" w:hint="eastAsia"/>
                 <w:szCs w:val="24"/>
               </w:rPr>
               <w:t>页面的加载时间</w:t>
             </w:r>
             <w:r>
               <w:rPr>
-                <w:rFonts w:eastAsia="黑体"/>
+                <w:rFonts w:eastAsia="SimHei"/>
                 <w:szCs w:val="24"/>
               </w:rPr>
               <w:t>(</w:t>
@@ -4911,14 +5157,14 @@
             <w:proofErr w:type="spellStart"/>
             <w:r>
               <w:rPr>
-                <w:rFonts w:eastAsia="黑体" w:hint="eastAsia"/>
+                <w:rFonts w:eastAsia="SimHei" w:hint="eastAsia"/>
                 <w:szCs w:val="24"/>
               </w:rPr>
               <w:t>m</w:t>
             </w:r>
             <w:r>
               <w:rPr>
-                <w:rFonts w:eastAsia="黑体"/>
+                <w:rFonts w:eastAsia="SimHei"/>
                 <w:szCs w:val="24"/>
               </w:rPr>
               <w:t>s</w:t>
@@ -4926,7 +5172,7 @@
             <w:proofErr w:type="spellEnd"/>
             <w:r>
               <w:rPr>
-                <w:rFonts w:eastAsia="黑体"/>
+                <w:rFonts w:eastAsia="SimHei"/>
                 <w:szCs w:val="24"/>
               </w:rPr>
               <w:t>)</w:t>
@@ -5021,13 +5267,13 @@
               <w:ind w:firstLineChars="0" w:firstLine="0"/>
               <w:jc w:val="center"/>
               <w:rPr>
-                <w:rFonts w:eastAsia="黑体"/>
-                <w:szCs w:val="24"/>
-              </w:rPr>
-            </w:pPr>
-            <w:r>
-              <w:rPr>
-                <w:rFonts w:eastAsia="黑体" w:hint="eastAsia"/>
+                <w:rFonts w:eastAsia="SimHei"/>
+                <w:szCs w:val="24"/>
+              </w:rPr>
+            </w:pPr>
+            <w:r>
+              <w:rPr>
+                <w:rFonts w:eastAsia="SimHei" w:hint="eastAsia"/>
                 <w:szCs w:val="24"/>
               </w:rPr>
               <w:t>请求对象数</w:t>
@@ -5122,20 +5368,20 @@
               <w:ind w:firstLineChars="0" w:firstLine="0"/>
               <w:jc w:val="center"/>
               <w:rPr>
-                <w:rFonts w:eastAsia="黑体"/>
-                <w:szCs w:val="24"/>
-              </w:rPr>
-            </w:pPr>
-            <w:r>
-              <w:rPr>
-                <w:rFonts w:eastAsia="黑体" w:hint="eastAsia"/>
+                <w:rFonts w:eastAsia="SimHei"/>
+                <w:szCs w:val="24"/>
+              </w:rPr>
+            </w:pPr>
+            <w:r>
+              <w:rPr>
+                <w:rFonts w:eastAsia="SimHei" w:hint="eastAsia"/>
                 <w:szCs w:val="24"/>
               </w:rPr>
               <w:t>TCP</w:t>
             </w:r>
             <w:r>
               <w:rPr>
-                <w:rFonts w:eastAsia="黑体" w:hint="eastAsia"/>
+                <w:rFonts w:eastAsia="SimHei" w:hint="eastAsia"/>
                 <w:szCs w:val="24"/>
               </w:rPr>
               <w:t>连接数</w:t>
@@ -5276,19 +5522,11 @@
         </w:rPr>
         <w:t>5.2</w:t>
       </w:r>
-      <w:proofErr w:type="gramStart"/>
-      <w:r>
-        <w:rPr>
-          <w:rFonts w:hint="eastAsia"/>
-        </w:rPr>
-        <w:t>两个</w:t>
-      </w:r>
-      <w:proofErr w:type="gramEnd"/>
-      <w:r>
-        <w:rPr>
-          <w:rFonts w:hint="eastAsia"/>
-        </w:rPr>
-        <w:t>表格数据说一说。</w:t>
+      <w:r>
+        <w:rPr>
+          <w:rFonts w:hint="eastAsia"/>
+        </w:rPr>
+        <w:t>两个表格数据说一说。</w:t>
       </w:r>
       <w:bookmarkEnd w:id="11"/>
     </w:p>
@@ -5297,6 +5535,124 @@
         <w:ind w:firstLine="480"/>
         <w:jc w:val="left"/>
       </w:pPr>
+      <w:r>
+        <w:rPr>
+          <w:rFonts w:hint="eastAsia"/>
+        </w:rPr>
+        <w:t>DNS</w:t>
+      </w:r>
+      <w:r>
+        <w:rPr>
+          <w:rFonts w:hint="eastAsia"/>
+        </w:rPr>
+        <w:t>缓存技术</w:t>
+      </w:r>
+      <w:r>
+        <w:rPr>
+          <w:rFonts w:hint="eastAsia"/>
+        </w:rPr>
+        <w:t>通过将对应的</w:t>
+      </w:r>
+      <w:r>
+        <w:rPr>
+          <w:rFonts w:hint="eastAsia"/>
+        </w:rPr>
+        <w:t>DNS</w:t>
+      </w:r>
+      <w:r>
+        <w:rPr>
+          <w:rFonts w:hint="eastAsia"/>
+        </w:rPr>
+        <w:t>记录缓存在本地（或上级</w:t>
+      </w:r>
+      <w:r>
+        <w:rPr>
+          <w:rFonts w:hint="eastAsia"/>
+        </w:rPr>
+        <w:t>DNS</w:t>
+      </w:r>
+      <w:r>
+        <w:rPr>
+          <w:rFonts w:hint="eastAsia"/>
+        </w:rPr>
+        <w:t>服务器）来</w:t>
+      </w:r>
+      <w:r>
+        <w:rPr>
+          <w:rFonts w:hint="eastAsia"/>
+        </w:rPr>
+        <w:t>减少获取对应网站</w:t>
+      </w:r>
+      <w:r>
+        <w:rPr>
+          <w:rFonts w:hint="eastAsia"/>
+        </w:rPr>
+        <w:t>IP</w:t>
+      </w:r>
+      <w:r>
+        <w:rPr>
+          <w:rFonts w:hint="eastAsia"/>
+        </w:rPr>
+        <w:t>地址的时间；而</w:t>
+      </w:r>
+      <w:r>
+        <w:rPr>
+          <w:rFonts w:hint="eastAsia"/>
+        </w:rPr>
+        <w:t>HTTP</w:t>
+      </w:r>
+      <w:r>
+        <w:rPr>
+          <w:rFonts w:hint="eastAsia"/>
+        </w:rPr>
+        <w:t>缓存</w:t>
+      </w:r>
+      <w:r>
+        <w:rPr>
+          <w:rFonts w:hint="eastAsia"/>
+        </w:rPr>
+        <w:t>则通过将相应的资源缓存在本地浏览器（或中间服务器，如</w:t>
+      </w:r>
+      <w:r>
+        <w:rPr>
+          <w:rFonts w:hint="eastAsia"/>
+        </w:rPr>
+        <w:t>CDN</w:t>
+      </w:r>
+      <w:r>
+        <w:rPr>
+          <w:rFonts w:hint="eastAsia"/>
+        </w:rPr>
+        <w:t>）来避免真正从网站服务器获取资源，从</w:t>
+      </w:r>
+      <w:r>
+        <w:rPr>
+          <w:rFonts w:hint="eastAsia"/>
+        </w:rPr>
+        <w:lastRenderedPageBreak/>
+        <w:t>而减少网站加载时间。</w:t>
+      </w:r>
+    </w:p>
+    <w:p>
+      <w:pPr>
+        <w:ind w:firstLine="480"/>
+        <w:jc w:val="left"/>
+        <w:rPr>
+          <w:rFonts w:hint="eastAsia"/>
+        </w:rPr>
+      </w:pPr>
+      <w:r>
+        <w:rPr>
+          <w:rFonts w:hint="eastAsia"/>
+        </w:rPr>
+        <w:t>从上方两个表格来看：</w:t>
+      </w:r>
+    </w:p>
+    <w:p>
+      <w:pPr>
+        <w:ind w:firstLine="480"/>
+        <w:jc w:val="left"/>
+      </w:pPr>
     </w:p>
     <w:p>
       <w:pPr>
@@ -5696,7 +6052,6 @@
         <w:t>报文，点击右键，选择“追踪流</w:t>
       </w:r>
       <w:r>
-        <w:lastRenderedPageBreak/>
         <w:t>-&gt;HTTP Stream</w:t>
       </w:r>
       <w:r>
@@ -5832,7 +6187,7 @@
     </w:p>
     <w:tbl>
       <w:tblPr>
-        <w:tblStyle w:val="ac"/>
+        <w:tblStyle w:val="TableGrid"/>
         <w:tblW w:w="0" w:type="auto"/>
         <w:tblInd w:w="421" w:type="dxa"/>
         <w:tblLook w:val="04A0" w:firstRow="1" w:lastRow="0" w:firstColumn="1" w:lastColumn="0" w:noHBand="0" w:noVBand="1"/>
@@ -5871,6 +6226,710 @@
                 <w:szCs w:val="13"/>
               </w:rPr>
             </w:pPr>
+            <w:proofErr w:type="spellStart"/>
+            <w:r>
+              <w:rPr>
+                <w:sz w:val="16"/>
+                <w:szCs w:val="13"/>
+              </w:rPr>
+              <w:t>ncat</w:t>
+            </w:r>
+            <w:proofErr w:type="spellEnd"/>
+            <w:r>
+              <w:rPr>
+                <w:sz w:val="16"/>
+                <w:szCs w:val="13"/>
+              </w:rPr>
+              <w:t xml:space="preserve"> -C www.people.com.cn 80</w:t>
+            </w:r>
+          </w:p>
+          <w:p>
+            <w:pPr>
+              <w:snapToGrid w:val="0"/>
+              <w:spacing w:line="240" w:lineRule="auto"/>
+              <w:ind w:firstLineChars="0" w:firstLine="0"/>
+              <w:rPr>
+                <w:sz w:val="16"/>
+                <w:szCs w:val="13"/>
+              </w:rPr>
+            </w:pPr>
+            <w:r>
+              <w:rPr>
+                <w:sz w:val="16"/>
+                <w:szCs w:val="13"/>
+              </w:rPr>
+              <w:t>GET / HTTP/1.1</w:t>
+            </w:r>
+          </w:p>
+          <w:p>
+            <w:pPr>
+              <w:snapToGrid w:val="0"/>
+              <w:spacing w:line="240" w:lineRule="auto"/>
+              <w:ind w:firstLineChars="0" w:firstLine="0"/>
+              <w:rPr>
+                <w:sz w:val="16"/>
+                <w:szCs w:val="13"/>
+              </w:rPr>
+            </w:pPr>
+            <w:r>
+              <w:rPr>
+                <w:sz w:val="16"/>
+                <w:szCs w:val="13"/>
+              </w:rPr>
+              <w:t>Host: people.com.cn</w:t>
+            </w:r>
+          </w:p>
+          <w:p>
+            <w:pPr>
+              <w:snapToGrid w:val="0"/>
+              <w:spacing w:line="240" w:lineRule="auto"/>
+              <w:ind w:firstLineChars="0" w:firstLine="0"/>
+              <w:rPr>
+                <w:sz w:val="16"/>
+                <w:szCs w:val="13"/>
+              </w:rPr>
+            </w:pPr>
+            <w:r>
+              <w:rPr>
+                <w:sz w:val="16"/>
+                <w:szCs w:val="13"/>
+              </w:rPr>
+              <w:t>User-Agent: Rin</w:t>
+            </w:r>
+          </w:p>
+          <w:p>
+            <w:pPr>
+              <w:snapToGrid w:val="0"/>
+              <w:spacing w:line="240" w:lineRule="auto"/>
+              <w:ind w:firstLineChars="0" w:firstLine="0"/>
+              <w:rPr>
+                <w:sz w:val="16"/>
+                <w:szCs w:val="13"/>
+              </w:rPr>
+            </w:pPr>
+          </w:p>
+          <w:p>
+            <w:pPr>
+              <w:snapToGrid w:val="0"/>
+              <w:spacing w:line="240" w:lineRule="auto"/>
+              <w:ind w:firstLineChars="0" w:firstLine="0"/>
+              <w:rPr>
+                <w:sz w:val="16"/>
+                <w:szCs w:val="13"/>
+              </w:rPr>
+            </w:pPr>
+            <w:r>
+              <w:rPr>
+                <w:sz w:val="16"/>
+                <w:szCs w:val="13"/>
+              </w:rPr>
+              <w:t>HTTP/1.1 200 OK</w:t>
+            </w:r>
+          </w:p>
+          <w:p>
+            <w:pPr>
+              <w:snapToGrid w:val="0"/>
+              <w:spacing w:line="240" w:lineRule="auto"/>
+              <w:ind w:firstLineChars="0" w:firstLine="0"/>
+              <w:rPr>
+                <w:sz w:val="16"/>
+                <w:szCs w:val="13"/>
+              </w:rPr>
+            </w:pPr>
+            <w:r>
+              <w:rPr>
+                <w:sz w:val="16"/>
+                <w:szCs w:val="13"/>
+              </w:rPr>
+              <w:t>Date: Mon, 16 Mar 2026 07:46:06 GMT</w:t>
+            </w:r>
+          </w:p>
+          <w:p>
+            <w:pPr>
+              <w:snapToGrid w:val="0"/>
+              <w:spacing w:line="240" w:lineRule="auto"/>
+              <w:ind w:firstLineChars="0" w:firstLine="0"/>
+              <w:rPr>
+                <w:sz w:val="16"/>
+                <w:szCs w:val="13"/>
+              </w:rPr>
+            </w:pPr>
+            <w:r>
+              <w:rPr>
+                <w:sz w:val="16"/>
+                <w:szCs w:val="13"/>
+              </w:rPr>
+              <w:t>Content-Type: text/html</w:t>
+            </w:r>
+          </w:p>
+          <w:p>
+            <w:pPr>
+              <w:snapToGrid w:val="0"/>
+              <w:spacing w:line="240" w:lineRule="auto"/>
+              <w:ind w:firstLineChars="0" w:firstLine="0"/>
+              <w:rPr>
+                <w:sz w:val="16"/>
+                <w:szCs w:val="13"/>
+              </w:rPr>
+            </w:pPr>
+            <w:r>
+              <w:rPr>
+                <w:sz w:val="16"/>
+                <w:szCs w:val="13"/>
+              </w:rPr>
+              <w:t>Content-Length: 156254</w:t>
+            </w:r>
+          </w:p>
+          <w:p>
+            <w:pPr>
+              <w:snapToGrid w:val="0"/>
+              <w:spacing w:line="240" w:lineRule="auto"/>
+              <w:ind w:firstLineChars="0" w:firstLine="0"/>
+              <w:rPr>
+                <w:sz w:val="16"/>
+                <w:szCs w:val="13"/>
+              </w:rPr>
+            </w:pPr>
+            <w:r>
+              <w:rPr>
+                <w:sz w:val="16"/>
+                <w:szCs w:val="13"/>
+              </w:rPr>
+              <w:t>Connection: keep-alive</w:t>
+            </w:r>
+          </w:p>
+          <w:p>
+            <w:pPr>
+              <w:snapToGrid w:val="0"/>
+              <w:spacing w:line="240" w:lineRule="auto"/>
+              <w:ind w:firstLineChars="0" w:firstLine="0"/>
+              <w:rPr>
+                <w:sz w:val="16"/>
+                <w:szCs w:val="13"/>
+              </w:rPr>
+            </w:pPr>
+            <w:r>
+              <w:rPr>
+                <w:sz w:val="16"/>
+                <w:szCs w:val="13"/>
+              </w:rPr>
+              <w:t>Server: RMW-WEB/260117</w:t>
+            </w:r>
+          </w:p>
+          <w:p>
+            <w:pPr>
+              <w:snapToGrid w:val="0"/>
+              <w:spacing w:line="240" w:lineRule="auto"/>
+              <w:ind w:firstLineChars="0" w:firstLine="0"/>
+              <w:rPr>
+                <w:sz w:val="16"/>
+                <w:szCs w:val="13"/>
+              </w:rPr>
+            </w:pPr>
+            <w:r>
+              <w:rPr>
+                <w:sz w:val="16"/>
+                <w:szCs w:val="13"/>
+              </w:rPr>
+              <w:t>Last-Modified: Mon, 16 Mar 2026 07:25:20 GMT</w:t>
+            </w:r>
+          </w:p>
+          <w:p>
+            <w:pPr>
+              <w:snapToGrid w:val="0"/>
+              <w:spacing w:line="240" w:lineRule="auto"/>
+              <w:ind w:firstLineChars="0" w:firstLine="0"/>
+              <w:rPr>
+                <w:sz w:val="16"/>
+                <w:szCs w:val="13"/>
+              </w:rPr>
+            </w:pPr>
+            <w:r>
+              <w:rPr>
+                <w:sz w:val="16"/>
+                <w:szCs w:val="13"/>
+              </w:rPr>
+              <w:t>ETag: "69b7b060-2625e"</w:t>
+            </w:r>
+          </w:p>
+          <w:p>
+            <w:pPr>
+              <w:snapToGrid w:val="0"/>
+              <w:spacing w:line="240" w:lineRule="auto"/>
+              <w:ind w:firstLineChars="0" w:firstLine="0"/>
+              <w:rPr>
+                <w:sz w:val="16"/>
+                <w:szCs w:val="13"/>
+              </w:rPr>
+            </w:pPr>
+            <w:r>
+              <w:rPr>
+                <w:sz w:val="16"/>
+                <w:szCs w:val="13"/>
+              </w:rPr>
+              <w:t>Accept-Ranges: bytes</w:t>
+            </w:r>
+          </w:p>
+          <w:p>
+            <w:pPr>
+              <w:snapToGrid w:val="0"/>
+              <w:spacing w:line="240" w:lineRule="auto"/>
+              <w:ind w:firstLineChars="0" w:firstLine="0"/>
+              <w:rPr>
+                <w:sz w:val="16"/>
+                <w:szCs w:val="13"/>
+              </w:rPr>
+            </w:pPr>
+            <w:r>
+              <w:rPr>
+                <w:sz w:val="16"/>
+                <w:szCs w:val="13"/>
+              </w:rPr>
+              <w:t>Via: 1.1 ID-7203207600205735 uproxy-2</w:t>
+            </w:r>
+          </w:p>
+          <w:p>
+            <w:pPr>
+              <w:snapToGrid w:val="0"/>
+              <w:spacing w:line="240" w:lineRule="auto"/>
+              <w:ind w:firstLineChars="0" w:firstLine="0"/>
+              <w:rPr>
+                <w:sz w:val="16"/>
+                <w:szCs w:val="13"/>
+              </w:rPr>
+            </w:pPr>
+            <w:r>
+              <w:rPr>
+                <w:sz w:val="16"/>
+                <w:szCs w:val="13"/>
+              </w:rPr>
+              <w:t>x-</w:t>
+            </w:r>
+            <w:proofErr w:type="gramStart"/>
+            <w:r>
+              <w:rPr>
+                <w:sz w:val="16"/>
+                <w:szCs w:val="13"/>
+              </w:rPr>
+              <w:t>via:</w:t>
+            </w:r>
+            <w:proofErr w:type="gramEnd"/>
+            <w:r>
+              <w:rPr>
+                <w:sz w:val="16"/>
+                <w:szCs w:val="13"/>
+              </w:rPr>
+              <w:t xml:space="preserve"> 1.1 PS-NGB-016jR175:4 (</w:t>
+            </w:r>
+            <w:proofErr w:type="spellStart"/>
+            <w:r>
+              <w:rPr>
+                <w:sz w:val="16"/>
+                <w:szCs w:val="13"/>
+              </w:rPr>
+              <w:t>Cdn</w:t>
+            </w:r>
+            <w:proofErr w:type="spellEnd"/>
+            <w:r>
+              <w:rPr>
+                <w:sz w:val="16"/>
+                <w:szCs w:val="13"/>
+              </w:rPr>
+              <w:t xml:space="preserve"> Cache Server V2.0), 1.1 PS-XIY-01sHn37:33 (</w:t>
+            </w:r>
+            <w:proofErr w:type="spellStart"/>
+            <w:r>
+              <w:rPr>
+                <w:sz w:val="16"/>
+                <w:szCs w:val="13"/>
+              </w:rPr>
+              <w:t>Cdn</w:t>
+            </w:r>
+            <w:proofErr w:type="spellEnd"/>
+            <w:r>
+              <w:rPr>
+                <w:sz w:val="16"/>
+                <w:szCs w:val="13"/>
+              </w:rPr>
+              <w:t xml:space="preserve"> Cache Server V2.0)</w:t>
+            </w:r>
+          </w:p>
+          <w:p>
+            <w:pPr>
+              <w:snapToGrid w:val="0"/>
+              <w:spacing w:line="240" w:lineRule="auto"/>
+              <w:ind w:firstLineChars="0" w:firstLine="0"/>
+              <w:rPr>
+                <w:sz w:val="16"/>
+                <w:szCs w:val="13"/>
+              </w:rPr>
+            </w:pPr>
+            <w:r>
+              <w:rPr>
+                <w:sz w:val="16"/>
+                <w:szCs w:val="13"/>
+              </w:rPr>
+              <w:t>x-</w:t>
+            </w:r>
+            <w:proofErr w:type="spellStart"/>
+            <w:r>
+              <w:rPr>
+                <w:sz w:val="16"/>
+                <w:szCs w:val="13"/>
+              </w:rPr>
+              <w:t>ws</w:t>
+            </w:r>
+            <w:proofErr w:type="spellEnd"/>
+            <w:r>
+              <w:rPr>
+                <w:sz w:val="16"/>
+                <w:szCs w:val="13"/>
+              </w:rPr>
+              <w:t>-request-id: 69b7b53e_PS-XIY-01sHn37_24293-15264</w:t>
+            </w:r>
+          </w:p>
+          <w:p>
+            <w:pPr>
+              <w:snapToGrid w:val="0"/>
+              <w:spacing w:line="240" w:lineRule="auto"/>
+              <w:ind w:firstLineChars="0" w:firstLine="0"/>
+              <w:rPr>
+                <w:sz w:val="16"/>
+                <w:szCs w:val="13"/>
+              </w:rPr>
+            </w:pPr>
+          </w:p>
+          <w:p>
+            <w:pPr>
+              <w:snapToGrid w:val="0"/>
+              <w:spacing w:line="240" w:lineRule="auto"/>
+              <w:ind w:firstLineChars="0" w:firstLine="0"/>
+              <w:rPr>
+                <w:sz w:val="16"/>
+                <w:szCs w:val="13"/>
+              </w:rPr>
+            </w:pPr>
+            <w:r>
+              <w:rPr>
+                <w:sz w:val="16"/>
+                <w:szCs w:val="13"/>
+              </w:rPr>
+              <w:t>&lt;!DOCTYPE html&gt;</w:t>
+            </w:r>
+          </w:p>
+          <w:p>
+            <w:pPr>
+              <w:snapToGrid w:val="0"/>
+              <w:spacing w:line="240" w:lineRule="auto"/>
+              <w:ind w:firstLineChars="0" w:firstLine="0"/>
+              <w:rPr>
+                <w:sz w:val="16"/>
+                <w:szCs w:val="13"/>
+              </w:rPr>
+            </w:pPr>
+            <w:r>
+              <w:rPr>
+                <w:sz w:val="16"/>
+                <w:szCs w:val="13"/>
+              </w:rPr>
+              <w:t>&lt;html lang="</w:t>
+            </w:r>
+            <w:proofErr w:type="spellStart"/>
+            <w:r>
+              <w:rPr>
+                <w:sz w:val="16"/>
+                <w:szCs w:val="13"/>
+              </w:rPr>
+              <w:t>zh</w:t>
+            </w:r>
+            <w:proofErr w:type="spellEnd"/>
+            <w:r>
+              <w:rPr>
+                <w:sz w:val="16"/>
+                <w:szCs w:val="13"/>
+              </w:rPr>
+              <w:t>-CN"&gt;</w:t>
+            </w:r>
+          </w:p>
+          <w:p>
+            <w:pPr>
+              <w:snapToGrid w:val="0"/>
+              <w:spacing w:line="240" w:lineRule="auto"/>
+              <w:ind w:firstLineChars="0" w:firstLine="0"/>
+              <w:rPr>
+                <w:sz w:val="16"/>
+                <w:szCs w:val="13"/>
+              </w:rPr>
+            </w:pPr>
+            <w:r>
+              <w:rPr>
+                <w:sz w:val="16"/>
+                <w:szCs w:val="13"/>
+              </w:rPr>
+              <w:t>&lt;head&gt;</w:t>
+            </w:r>
+          </w:p>
+          <w:p>
+            <w:pPr>
+              <w:snapToGrid w:val="0"/>
+              <w:spacing w:line="240" w:lineRule="auto"/>
+              <w:ind w:firstLineChars="0" w:firstLine="0"/>
+              <w:rPr>
+                <w:sz w:val="16"/>
+                <w:szCs w:val="13"/>
+              </w:rPr>
+            </w:pPr>
+            <w:r>
+              <w:rPr>
+                <w:sz w:val="16"/>
+                <w:szCs w:val="13"/>
+              </w:rPr>
+              <w:t>&lt;meta http-</w:t>
+            </w:r>
+            <w:proofErr w:type="spellStart"/>
+            <w:r>
+              <w:rPr>
+                <w:sz w:val="16"/>
+                <w:szCs w:val="13"/>
+              </w:rPr>
+              <w:t>equiv</w:t>
+            </w:r>
+            <w:proofErr w:type="spellEnd"/>
+            <w:r>
+              <w:rPr>
+                <w:sz w:val="16"/>
+                <w:szCs w:val="13"/>
+              </w:rPr>
+              <w:t>="content-type" content="text/</w:t>
+            </w:r>
+            <w:proofErr w:type="spellStart"/>
+            <w:proofErr w:type="gramStart"/>
+            <w:r>
+              <w:rPr>
+                <w:sz w:val="16"/>
+                <w:szCs w:val="13"/>
+              </w:rPr>
+              <w:t>html;charset</w:t>
+            </w:r>
+            <w:proofErr w:type="spellEnd"/>
+            <w:proofErr w:type="gramEnd"/>
+            <w:r>
+              <w:rPr>
+                <w:sz w:val="16"/>
+                <w:szCs w:val="13"/>
+              </w:rPr>
+              <w:t>=UTF-8"/&gt;</w:t>
+            </w:r>
+          </w:p>
+          <w:p>
+            <w:pPr>
+              <w:snapToGrid w:val="0"/>
+              <w:spacing w:line="240" w:lineRule="auto"/>
+              <w:ind w:firstLineChars="0" w:firstLine="0"/>
+              <w:rPr>
+                <w:sz w:val="16"/>
+                <w:szCs w:val="13"/>
+              </w:rPr>
+            </w:pPr>
+            <w:r>
+              <w:rPr>
+                <w:sz w:val="16"/>
+                <w:szCs w:val="13"/>
+              </w:rPr>
+              <w:t>&lt;meta http-</w:t>
+            </w:r>
+            <w:proofErr w:type="spellStart"/>
+            <w:r>
+              <w:rPr>
+                <w:sz w:val="16"/>
+                <w:szCs w:val="13"/>
+              </w:rPr>
+              <w:t>equiv</w:t>
+            </w:r>
+            <w:proofErr w:type="spellEnd"/>
+            <w:r>
+              <w:rPr>
+                <w:sz w:val="16"/>
+                <w:szCs w:val="13"/>
+              </w:rPr>
+              <w:t>="Content-Language" content="utf-8" /&gt;</w:t>
+            </w:r>
+          </w:p>
+          <w:p>
+            <w:pPr>
+              <w:snapToGrid w:val="0"/>
+              <w:spacing w:line="240" w:lineRule="auto"/>
+              <w:ind w:firstLineChars="0" w:firstLine="0"/>
+              <w:rPr>
+                <w:sz w:val="16"/>
+                <w:szCs w:val="13"/>
+              </w:rPr>
+            </w:pPr>
+            <w:r>
+              <w:rPr>
+                <w:sz w:val="16"/>
+                <w:szCs w:val="13"/>
+              </w:rPr>
+              <w:t>&lt;meta content="all" name="robots" /&gt;</w:t>
+            </w:r>
+          </w:p>
+          <w:p>
+            <w:pPr>
+              <w:snapToGrid w:val="0"/>
+              <w:spacing w:line="240" w:lineRule="auto"/>
+              <w:ind w:firstLineChars="0" w:firstLine="0"/>
+              <w:rPr>
+                <w:rFonts w:hint="eastAsia"/>
+                <w:sz w:val="16"/>
+                <w:szCs w:val="13"/>
+              </w:rPr>
+            </w:pPr>
+            <w:r>
+              <w:rPr>
+                <w:rFonts w:hint="eastAsia"/>
+                <w:sz w:val="16"/>
+                <w:szCs w:val="13"/>
+              </w:rPr>
+              <w:t>&lt;title&gt;</w:t>
+            </w:r>
+            <w:r>
+              <w:rPr>
+                <w:rFonts w:hint="eastAsia"/>
+                <w:sz w:val="16"/>
+                <w:szCs w:val="13"/>
+              </w:rPr>
+              <w:t>人民网</w:t>
+            </w:r>
+            <w:r>
+              <w:rPr>
+                <w:rFonts w:hint="eastAsia"/>
+                <w:sz w:val="16"/>
+                <w:szCs w:val="13"/>
+              </w:rPr>
+              <w:t>_</w:t>
+            </w:r>
+            <w:r>
+              <w:rPr>
+                <w:rFonts w:hint="eastAsia"/>
+                <w:sz w:val="16"/>
+                <w:szCs w:val="13"/>
+              </w:rPr>
+              <w:t>网上的人民日报</w:t>
+            </w:r>
+            <w:r>
+              <w:rPr>
+                <w:rFonts w:hint="eastAsia"/>
+                <w:sz w:val="16"/>
+                <w:szCs w:val="13"/>
+              </w:rPr>
+              <w:t>&lt;/title&gt;</w:t>
+            </w:r>
+          </w:p>
+          <w:p>
+            <w:pPr>
+              <w:snapToGrid w:val="0"/>
+              <w:spacing w:line="240" w:lineRule="auto"/>
+              <w:ind w:firstLineChars="0" w:firstLine="0"/>
+              <w:rPr>
+                <w:rFonts w:hint="eastAsia"/>
+                <w:sz w:val="16"/>
+                <w:szCs w:val="13"/>
+              </w:rPr>
+            </w:pPr>
+            <w:proofErr w:type="gramStart"/>
+            <w:r>
+              <w:rPr>
+                <w:rFonts w:hint="eastAsia"/>
+                <w:sz w:val="16"/>
+                <w:szCs w:val="13"/>
+              </w:rPr>
+              <w:t>&lt;!--</w:t>
+            </w:r>
+            <w:proofErr w:type="gramEnd"/>
+            <w:r>
+              <w:rPr>
+                <w:rFonts w:hint="eastAsia"/>
+                <w:sz w:val="16"/>
+                <w:szCs w:val="13"/>
+              </w:rPr>
+              <w:t>热力图</w:t>
+            </w:r>
+            <w:r>
+              <w:rPr>
+                <w:rFonts w:hint="eastAsia"/>
+                <w:sz w:val="16"/>
+                <w:szCs w:val="13"/>
+              </w:rPr>
+              <w:t>--&gt;</w:t>
+            </w:r>
+          </w:p>
+          <w:p>
+            <w:pPr>
+              <w:snapToGrid w:val="0"/>
+              <w:spacing w:line="240" w:lineRule="auto"/>
+              <w:ind w:firstLineChars="0" w:firstLine="0"/>
+              <w:rPr>
+                <w:sz w:val="16"/>
+                <w:szCs w:val="13"/>
+              </w:rPr>
+            </w:pPr>
+            <w:r>
+              <w:rPr>
+                <w:sz w:val="16"/>
+                <w:szCs w:val="13"/>
+              </w:rPr>
+              <w:t>&lt;meta name="</w:t>
+            </w:r>
+            <w:proofErr w:type="spellStart"/>
+            <w:r>
+              <w:rPr>
+                <w:sz w:val="16"/>
+                <w:szCs w:val="13"/>
+              </w:rPr>
+              <w:t>uctk</w:t>
+            </w:r>
+            <w:proofErr w:type="spellEnd"/>
+            <w:r>
+              <w:rPr>
+                <w:sz w:val="16"/>
+                <w:szCs w:val="13"/>
+              </w:rPr>
+              <w:t>" content="enabled"&gt;</w:t>
+            </w:r>
+          </w:p>
+          <w:p>
+            <w:pPr>
+              <w:snapToGrid w:val="0"/>
+              <w:spacing w:line="240" w:lineRule="auto"/>
+              <w:ind w:firstLineChars="0" w:firstLine="0"/>
+              <w:rPr>
+                <w:sz w:val="16"/>
+                <w:szCs w:val="13"/>
+              </w:rPr>
+            </w:pPr>
+            <w:r>
+              <w:rPr>
+                <w:sz w:val="16"/>
+                <w:szCs w:val="13"/>
+              </w:rPr>
+              <w:t>&lt;meta name="renderer" content="</w:t>
+            </w:r>
+            <w:proofErr w:type="spellStart"/>
+            <w:r>
+              <w:rPr>
+                <w:sz w:val="16"/>
+                <w:szCs w:val="13"/>
+              </w:rPr>
+              <w:t>webkit</w:t>
+            </w:r>
+            <w:proofErr w:type="spellEnd"/>
+            <w:r>
+              <w:rPr>
+                <w:sz w:val="16"/>
+                <w:szCs w:val="13"/>
+              </w:rPr>
+              <w:t>" /&gt;</w:t>
+            </w:r>
           </w:p>
         </w:tc>
       </w:tr>
@@ -5912,19 +6971,19 @@
       </w:r>
       <w:r>
         <w:rPr>
-          <w:rFonts w:eastAsia="黑体"/>
+          <w:rFonts w:eastAsia="SimHei"/>
         </w:rPr>
         <w:t>HTTPS</w:t>
       </w:r>
       <w:r>
         <w:rPr>
-          <w:rFonts w:eastAsia="黑体" w:hint="eastAsia"/>
+          <w:rFonts w:eastAsia="SimHei" w:hint="eastAsia"/>
         </w:rPr>
         <w:t>协议分析</w:t>
       </w:r>
       <w:r>
         <w:rPr>
-          <w:rFonts w:eastAsia="黑体" w:hint="eastAsia"/>
+          <w:rFonts w:eastAsia="SimHei" w:hint="eastAsia"/>
         </w:rPr>
         <w:t>。</w:t>
       </w:r>
@@ -5999,7 +7058,7 @@
     </w:p>
     <w:p>
       <w:pPr>
-        <w:pStyle w:val="3"/>
+        <w:pStyle w:val="Heading3"/>
         <w:numPr>
           <w:ilvl w:val="2"/>
           <w:numId w:val="9"/>
@@ -6168,7 +7227,7 @@
     </w:p>
     <w:tbl>
       <w:tblPr>
-        <w:tblStyle w:val="ac"/>
+        <w:tblStyle w:val="TableGrid"/>
         <w:tblW w:w="0" w:type="auto"/>
         <w:tblInd w:w="421" w:type="dxa"/>
         <w:tblLook w:val="04A0" w:firstRow="1" w:lastRow="0" w:firstColumn="1" w:lastColumn="0" w:noHBand="0" w:noVBand="1"/>
@@ -6330,7 +7389,7 @@
     </w:p>
     <w:tbl>
       <w:tblPr>
-        <w:tblStyle w:val="ac"/>
+        <w:tblStyle w:val="TableGrid"/>
         <w:tblW w:w="0" w:type="auto"/>
         <w:tblInd w:w="421" w:type="dxa"/>
         <w:tblLook w:val="04A0" w:firstRow="1" w:lastRow="0" w:firstColumn="1" w:lastColumn="0" w:noHBand="0" w:noVBand="1"/>
@@ -6349,18 +7408,18 @@
               <w:ind w:firstLineChars="0" w:firstLine="0"/>
               <w:jc w:val="left"/>
               <w:rPr>
-                <w:rFonts w:eastAsia="宋体"/>
-              </w:rPr>
-            </w:pPr>
-            <w:r>
-              <w:rPr>
-                <w:rFonts w:eastAsia="宋体" w:hint="eastAsia"/>
+                <w:rFonts w:eastAsia="SimSun"/>
+              </w:rPr>
+            </w:pPr>
+            <w:r>
+              <w:rPr>
+                <w:rFonts w:eastAsia="SimSun" w:hint="eastAsia"/>
               </w:rPr>
               <w:t>DNS</w:t>
             </w:r>
             <w:r>
               <w:rPr>
-                <w:rFonts w:eastAsia="宋体" w:hint="eastAsia"/>
+                <w:rFonts w:eastAsia="SimSun" w:hint="eastAsia"/>
               </w:rPr>
               <w:t>时间</w:t>
             </w:r>
@@ -6388,24 +7447,24 @@
               <w:ind w:firstLineChars="0" w:firstLine="0"/>
               <w:jc w:val="left"/>
               <w:rPr>
-                <w:rFonts w:eastAsia="宋体"/>
-              </w:rPr>
-            </w:pPr>
-            <w:r>
-              <w:rPr>
-                <w:rFonts w:eastAsia="宋体" w:hint="eastAsia"/>
+                <w:rFonts w:eastAsia="SimSun"/>
+              </w:rPr>
+            </w:pPr>
+            <w:r>
+              <w:rPr>
+                <w:rFonts w:eastAsia="SimSun" w:hint="eastAsia"/>
               </w:rPr>
               <w:t>TCP</w:t>
             </w:r>
             <w:r>
               <w:rPr>
-                <w:rFonts w:eastAsia="宋体" w:hint="eastAsia"/>
+                <w:rFonts w:eastAsia="SimSun" w:hint="eastAsia"/>
               </w:rPr>
               <w:t>连接建立的</w:t>
             </w:r>
             <w:r>
               <w:rPr>
-                <w:rFonts w:eastAsia="宋体" w:hint="eastAsia"/>
+                <w:rFonts w:eastAsia="SimSun" w:hint="eastAsia"/>
               </w:rPr>
               <w:t>时间</w:t>
             </w:r>
@@ -6433,24 +7492,24 @@
               <w:ind w:firstLineChars="0" w:firstLine="0"/>
               <w:jc w:val="left"/>
               <w:rPr>
-                <w:rFonts w:eastAsia="宋体"/>
-              </w:rPr>
-            </w:pPr>
-            <w:r>
-              <w:rPr>
-                <w:rFonts w:eastAsia="宋体" w:hint="eastAsia"/>
+                <w:rFonts w:eastAsia="SimSun"/>
+              </w:rPr>
+            </w:pPr>
+            <w:r>
+              <w:rPr>
+                <w:rFonts w:eastAsia="SimSun" w:hint="eastAsia"/>
               </w:rPr>
               <w:t>HTTP</w:t>
             </w:r>
             <w:r>
               <w:rPr>
-                <w:rFonts w:eastAsia="宋体" w:hint="eastAsia"/>
+                <w:rFonts w:eastAsia="SimSun" w:hint="eastAsia"/>
               </w:rPr>
               <w:t>的完整</w:t>
             </w:r>
             <w:r>
               <w:rPr>
-                <w:rFonts w:eastAsia="宋体" w:hint="eastAsia"/>
+                <w:rFonts w:eastAsia="SimSun" w:hint="eastAsia"/>
               </w:rPr>
               <w:t>时间</w:t>
             </w:r>
@@ -6482,7 +7541,7 @@
     </w:p>
     <w:p>
       <w:pPr>
-        <w:pStyle w:val="2"/>
+        <w:pStyle w:val="Heading2"/>
         <w:snapToGrid w:val="0"/>
         <w:spacing w:before="312" w:after="156"/>
       </w:pPr>
@@ -6565,16 +7624,8 @@
         <w:rPr>
           <w:rFonts w:hint="eastAsia"/>
         </w:rPr>
-        <w:t>所有的内</w:t>
-      </w:r>
-      <w:proofErr w:type="gramStart"/>
-      <w:r>
-        <w:rPr>
-          <w:rFonts w:hint="eastAsia"/>
-        </w:rPr>
-        <w:t>嵌对象</w:t>
-      </w:r>
-      <w:proofErr w:type="gramEnd"/>
+        <w:t>所有的内嵌对象</w:t>
+      </w:r>
       <w:r>
         <w:rPr>
           <w:rFonts w:hint="eastAsia"/>
@@ -6661,7 +7712,7 @@
     </w:p>
     <w:tbl>
       <w:tblPr>
-        <w:tblStyle w:val="ac"/>
+        <w:tblStyle w:val="TableGrid"/>
         <w:tblW w:w="0" w:type="auto"/>
         <w:tblInd w:w="421" w:type="dxa"/>
         <w:tblLook w:val="04A0" w:firstRow="1" w:lastRow="0" w:firstColumn="1" w:lastColumn="0" w:noHBand="0" w:noVBand="1"/>
@@ -6716,7 +7767,6 @@
         <w:rPr>
           <w:rFonts w:hint="eastAsia"/>
         </w:rPr>
-        <w:lastRenderedPageBreak/>
         <w:t>1</w:t>
       </w:r>
       <w:r>
@@ -6836,7 +7886,7 @@
     </w:p>
     <w:tbl>
       <w:tblPr>
-        <w:tblStyle w:val="ac"/>
+        <w:tblStyle w:val="TableGrid"/>
         <w:tblW w:w="0" w:type="auto"/>
         <w:tblInd w:w="421" w:type="dxa"/>
         <w:tblLook w:val="04A0" w:firstRow="1" w:lastRow="0" w:firstColumn="1" w:lastColumn="0" w:noHBand="0" w:noVBand="1"/>
@@ -6855,18 +7905,18 @@
               <w:ind w:firstLineChars="0" w:firstLine="0"/>
               <w:jc w:val="left"/>
               <w:rPr>
-                <w:rFonts w:eastAsia="宋体"/>
-              </w:rPr>
-            </w:pPr>
-            <w:r>
-              <w:rPr>
-                <w:rFonts w:eastAsia="宋体" w:hint="eastAsia"/>
+                <w:rFonts w:eastAsia="SimSun"/>
+              </w:rPr>
+            </w:pPr>
+            <w:r>
+              <w:rPr>
+                <w:rFonts w:eastAsia="SimSun" w:hint="eastAsia"/>
               </w:rPr>
               <w:t>DNS</w:t>
             </w:r>
             <w:r>
               <w:rPr>
-                <w:rFonts w:eastAsia="宋体" w:hint="eastAsia"/>
+                <w:rFonts w:eastAsia="SimSun" w:hint="eastAsia"/>
               </w:rPr>
               <w:t>时间</w:t>
             </w:r>
@@ -6896,19 +7946,19 @@
             </w:pPr>
             <w:r>
               <w:rPr>
-                <w:rFonts w:eastAsia="宋体" w:hint="eastAsia"/>
+                <w:rFonts w:eastAsia="SimSun" w:hint="eastAsia"/>
               </w:rPr>
               <w:t>使用了几个</w:t>
             </w:r>
             <w:r>
               <w:rPr>
-                <w:rFonts w:eastAsia="宋体" w:hint="eastAsia"/>
+                <w:rFonts w:eastAsia="SimSun" w:hint="eastAsia"/>
               </w:rPr>
               <w:t>TCP</w:t>
             </w:r>
             <w:r>
               <w:rPr>
-                <w:rFonts w:eastAsia="宋体" w:hint="eastAsia"/>
+                <w:rFonts w:eastAsia="SimSun" w:hint="eastAsia"/>
               </w:rPr>
               <w:t>连接</w:t>
             </w:r>
@@ -6936,24 +7986,24 @@
               <w:ind w:firstLineChars="0" w:firstLine="0"/>
               <w:jc w:val="left"/>
               <w:rPr>
-                <w:rFonts w:eastAsia="宋体"/>
-              </w:rPr>
-            </w:pPr>
-            <w:r>
-              <w:rPr>
-                <w:rFonts w:eastAsia="宋体" w:hint="eastAsia"/>
+                <w:rFonts w:eastAsia="SimSun"/>
+              </w:rPr>
+            </w:pPr>
+            <w:r>
+              <w:rPr>
+                <w:rFonts w:eastAsia="SimSun" w:hint="eastAsia"/>
               </w:rPr>
               <w:t>TCP</w:t>
             </w:r>
             <w:r>
               <w:rPr>
-                <w:rFonts w:eastAsia="宋体" w:hint="eastAsia"/>
+                <w:rFonts w:eastAsia="SimSun" w:hint="eastAsia"/>
               </w:rPr>
               <w:t>连接建立的</w:t>
             </w:r>
             <w:r>
               <w:rPr>
-                <w:rFonts w:eastAsia="宋体" w:hint="eastAsia"/>
+                <w:rFonts w:eastAsia="SimSun" w:hint="eastAsia"/>
               </w:rPr>
               <w:t>时间</w:t>
             </w:r>
@@ -6981,24 +8031,24 @@
               <w:ind w:firstLineChars="0" w:firstLine="0"/>
               <w:jc w:val="left"/>
               <w:rPr>
-                <w:rFonts w:eastAsia="宋体"/>
-              </w:rPr>
-            </w:pPr>
-            <w:r>
-              <w:rPr>
-                <w:rFonts w:eastAsia="宋体" w:hint="eastAsia"/>
+                <w:rFonts w:eastAsia="SimSun"/>
+              </w:rPr>
+            </w:pPr>
+            <w:r>
+              <w:rPr>
+                <w:rFonts w:eastAsia="SimSun" w:hint="eastAsia"/>
               </w:rPr>
               <w:t>HTTP</w:t>
             </w:r>
             <w:r>
               <w:rPr>
-                <w:rFonts w:eastAsia="宋体" w:hint="eastAsia"/>
+                <w:rFonts w:eastAsia="SimSun" w:hint="eastAsia"/>
               </w:rPr>
               <w:t>的完整</w:t>
             </w:r>
             <w:r>
               <w:rPr>
-                <w:rFonts w:eastAsia="宋体" w:hint="eastAsia"/>
+                <w:rFonts w:eastAsia="SimSun" w:hint="eastAsia"/>
               </w:rPr>
               <w:t>时间</w:t>
             </w:r>
@@ -7021,6 +8071,9 @@
       <w:pPr>
         <w:ind w:firstLine="480"/>
         <w:jc w:val="left"/>
+        <w:rPr>
+          <w:rFonts w:hint="eastAsia"/>
+        </w:rPr>
       </w:pPr>
     </w:p>
     <w:p>
@@ -7029,12 +8082,12 @@
       </w:pPr>
     </w:p>
     <w:sectPr>
-      <w:headerReference w:type="even" r:id="rId9"/>
-      <w:headerReference w:type="default" r:id="rId10"/>
-      <w:footerReference w:type="even" r:id="rId11"/>
-      <w:footerReference w:type="default" r:id="rId12"/>
-      <w:headerReference w:type="first" r:id="rId13"/>
-      <w:footerReference w:type="first" r:id="rId14"/>
+      <w:headerReference w:type="even" r:id="rId13"/>
+      <w:headerReference w:type="default" r:id="rId14"/>
+      <w:footerReference w:type="even" r:id="rId15"/>
+      <w:footerReference w:type="default" r:id="rId16"/>
+      <w:headerReference w:type="first" r:id="rId17"/>
+      <w:footerReference w:type="first" r:id="rId18"/>
       <w:pgSz w:w="11906" w:h="16838"/>
       <w:pgMar w:top="1440" w:right="1800" w:bottom="1440" w:left="1800" w:header="851" w:footer="992" w:gutter="0"/>
       <w:cols w:space="425"/>
@@ -7075,7 +8128,7 @@
 <w:ftr xmlns:wpc="http://schemas.microsoft.com/office/word/2010/wordprocessingCanvas" xmlns:cx="http://schemas.microsoft.com/office/drawing/2014/chartex" xmlns:cx1="http://schemas.microsoft.com/office/drawing/2015/9/8/chartex" xmlns:cx2="http://schemas.microsoft.com/office/drawing/2015/10/21/chartex" xmlns:cx3="http://schemas.microsoft.com/office/drawing/2016/5/9/chartex" xmlns:cx4="http://schemas.microsoft.com/office/drawing/2016/5/10/chartex" xmlns:cx5="http://schemas.microsoft.com/office/drawing/2016/5/11/chartex" xmlns:cx6="http://schemas.microsoft.com/office/drawing/2016/5/12/chartex" xmlns:cx7="http://schemas.microsoft.com/office/drawing/2016/5/13/chartex" xmlns:cx8="http://schemas.microsoft.com/office/drawing/2016/5/14/chartex" xmlns:mc="http://schemas.openxmlformats.org/markup-compatibility/2006" xmlns:aink="http://schemas.microsoft.com/office/drawing/2016/ink" xmlns:am3d="http://schemas.microsoft.com/office/drawing/2017/model3d" xmlns:o="urn:schemas-microsoft-com:office:office" xmlns:oel="http://schemas.microsoft.com/office/2019/extlst" xmlns:r="http://schemas.openxmlformats.org/officeDocument/2006/relationships" xmlns:m="http://schemas.openxmlformats.org/officeDocument/2006/math" xmlns:v="urn:schemas-microsoft-com:vml" xmlns:wp14="http://schemas.microsoft.com/office/word/2010/wordprocessingDrawing" xmlns:wp="http://schemas.openxmlformats.org/drawingml/2006/wordprocessingDrawing" xmlns:w10="urn:schemas-microsoft-com:office:word" xmlns:w="http://schemas.openxmlformats.org/wordprocessingml/2006/main" xmlns:w14="http://schemas.microsoft.com/office/word/2010/wordml" xmlns:w15="http://schemas.microsoft.com/office/word/2012/wordml" xmlns:w16cex="http://schemas.microsoft.com/office/word/2018/wordml/cex" xmlns:w16cid="http://schemas.microsoft.com/office/word/2016/wordml/cid" xmlns:w16="http://schemas.microsoft.com/office/word/2018/wordml" xmlns:w16du="http://schemas.microsoft.com/office/word/2023/wordml/word16du" xmlns:w16sdtdh="http://schemas.microsoft.com/office/word/2020/wordml/sdtdatahash" xmlns:w16sdtfl="http://schemas.microsoft.com/office/word/2024/wordml/sdtformatlock" xmlns:w16se="http://schemas.microsoft.com/office/word/2015/wordml/symex" xmlns:wpg="http://schemas.microsoft.com/office/word/2010/wordprocessingGroup" xmlns:wpi="http://schemas.microsoft.com/office/word/2010/wordprocessingInk" xmlns:wne="http://schemas.microsoft.com/office/word/2006/wordml" xmlns:wps="http://schemas.microsoft.com/office/word/2010/wordprocessingShape" mc:Ignorable="w14 w15 w16se w16cid w16 w16cex w16sdtdh w16sdtfl w16du wp14">
   <w:p>
     <w:pPr>
-      <w:pStyle w:val="a7"/>
+      <w:pStyle w:val="Footer"/>
       <w:ind w:firstLine="360"/>
     </w:pPr>
   </w:p>
@@ -7086,7 +8139,7 @@
 <w:ftr xmlns:wpc="http://schemas.microsoft.com/office/word/2010/wordprocessingCanvas" xmlns:cx="http://schemas.microsoft.com/office/drawing/2014/chartex" xmlns:cx1="http://schemas.microsoft.com/office/drawing/2015/9/8/chartex" xmlns:cx2="http://schemas.microsoft.com/office/drawing/2015/10/21/chartex" xmlns:cx3="http://schemas.microsoft.com/office/drawing/2016/5/9/chartex" xmlns:cx4="http://schemas.microsoft.com/office/drawing/2016/5/10/chartex" xmlns:cx5="http://schemas.microsoft.com/office/drawing/2016/5/11/chartex" xmlns:cx6="http://schemas.microsoft.com/office/drawing/2016/5/12/chartex" xmlns:cx7="http://schemas.microsoft.com/office/drawing/2016/5/13/chartex" xmlns:cx8="http://schemas.microsoft.com/office/drawing/2016/5/14/chartex" xmlns:mc="http://schemas.openxmlformats.org/markup-compatibility/2006" xmlns:aink="http://schemas.microsoft.com/office/drawing/2016/ink" xmlns:am3d="http://schemas.microsoft.com/office/drawing/2017/model3d" xmlns:o="urn:schemas-microsoft-com:office:office" xmlns:oel="http://schemas.microsoft.com/office/2019/extlst" xmlns:r="http://schemas.openxmlformats.org/officeDocument/2006/relationships" xmlns:m="http://schemas.openxmlformats.org/officeDocument/2006/math" xmlns:v="urn:schemas-microsoft-com:vml" xmlns:wp14="http://schemas.microsoft.com/office/word/2010/wordprocessingDrawing" xmlns:wp="http://schemas.openxmlformats.org/drawingml/2006/wordprocessingDrawing" xmlns:w10="urn:schemas-microsoft-com:office:word" xmlns:w="http://schemas.openxmlformats.org/wordprocessingml/2006/main" xmlns:w14="http://schemas.microsoft.com/office/word/2010/wordml" xmlns:w15="http://schemas.microsoft.com/office/word/2012/wordml" xmlns:w16cex="http://schemas.microsoft.com/office/word/2018/wordml/cex" xmlns:w16cid="http://schemas.microsoft.com/office/word/2016/wordml/cid" xmlns:w16="http://schemas.microsoft.com/office/word/2018/wordml" xmlns:w16du="http://schemas.microsoft.com/office/word/2023/wordml/word16du" xmlns:w16sdtdh="http://schemas.microsoft.com/office/word/2020/wordml/sdtdatahash" xmlns:w16sdtfl="http://schemas.microsoft.com/office/word/2024/wordml/sdtformatlock" xmlns:w16se="http://schemas.microsoft.com/office/word/2015/wordml/symex" xmlns:wpg="http://schemas.microsoft.com/office/word/2010/wordprocessingGroup" xmlns:wpi="http://schemas.microsoft.com/office/word/2010/wordprocessingInk" xmlns:wne="http://schemas.microsoft.com/office/word/2006/wordml" xmlns:wps="http://schemas.microsoft.com/office/word/2010/wordprocessingShape" mc:Ignorable="w14 w15 w16se w16cid w16 w16cex w16sdtdh w16sdtfl w16du wp14">
   <w:p>
     <w:pPr>
-      <w:pStyle w:val="a7"/>
+      <w:pStyle w:val="Footer"/>
       <w:ind w:firstLine="360"/>
     </w:pPr>
   </w:p>
@@ -7097,7 +8150,7 @@
 <w:ftr xmlns:wpc="http://schemas.microsoft.com/office/word/2010/wordprocessingCanvas" xmlns:cx="http://schemas.microsoft.com/office/drawing/2014/chartex" xmlns:cx1="http://schemas.microsoft.com/office/drawing/2015/9/8/chartex" xmlns:cx2="http://schemas.microsoft.com/office/drawing/2015/10/21/chartex" xmlns:cx3="http://schemas.microsoft.com/office/drawing/2016/5/9/chartex" xmlns:cx4="http://schemas.microsoft.com/office/drawing/2016/5/10/chartex" xmlns:cx5="http://schemas.microsoft.com/office/drawing/2016/5/11/chartex" xmlns:cx6="http://schemas.microsoft.com/office/drawing/2016/5/12/chartex" xmlns:cx7="http://schemas.microsoft.com/office/drawing/2016/5/13/chartex" xmlns:cx8="http://schemas.microsoft.com/office/drawing/2016/5/14/chartex" xmlns:mc="http://schemas.openxmlformats.org/markup-compatibility/2006" xmlns:aink="http://schemas.microsoft.com/office/drawing/2016/ink" xmlns:am3d="http://schemas.microsoft.com/office/drawing/2017/model3d" xmlns:o="urn:schemas-microsoft-com:office:office" xmlns:oel="http://schemas.microsoft.com/office/2019/extlst" xmlns:r="http://schemas.openxmlformats.org/officeDocument/2006/relationships" xmlns:m="http://schemas.openxmlformats.org/officeDocument/2006/math" xmlns:v="urn:schemas-microsoft-com:vml" xmlns:wp14="http://schemas.microsoft.com/office/word/2010/wordprocessingDrawing" xmlns:wp="http://schemas.openxmlformats.org/drawingml/2006/wordprocessingDrawing" xmlns:w10="urn:schemas-microsoft-com:office:word" xmlns:w="http://schemas.openxmlformats.org/wordprocessingml/2006/main" xmlns:w14="http://schemas.microsoft.com/office/word/2010/wordml" xmlns:w15="http://schemas.microsoft.com/office/word/2012/wordml" xmlns:w16cex="http://schemas.microsoft.com/office/word/2018/wordml/cex" xmlns:w16cid="http://schemas.microsoft.com/office/word/2016/wordml/cid" xmlns:w16="http://schemas.microsoft.com/office/word/2018/wordml" xmlns:w16du="http://schemas.microsoft.com/office/word/2023/wordml/word16du" xmlns:w16sdtdh="http://schemas.microsoft.com/office/word/2020/wordml/sdtdatahash" xmlns:w16sdtfl="http://schemas.microsoft.com/office/word/2024/wordml/sdtformatlock" xmlns:w16se="http://schemas.microsoft.com/office/word/2015/wordml/symex" xmlns:wpg="http://schemas.microsoft.com/office/word/2010/wordprocessingGroup" xmlns:wpi="http://schemas.microsoft.com/office/word/2010/wordprocessingInk" xmlns:wne="http://schemas.microsoft.com/office/word/2006/wordml" xmlns:wps="http://schemas.microsoft.com/office/word/2010/wordprocessingShape" mc:Ignorable="w14 w15 w16se w16cid w16 w16cex w16sdtdh w16sdtfl w16du wp14">
   <w:p>
     <w:pPr>
-      <w:pStyle w:val="a7"/>
+      <w:pStyle w:val="Footer"/>
       <w:ind w:firstLine="360"/>
     </w:pPr>
   </w:p>
@@ -7133,7 +8186,7 @@
 <w:hdr xmlns:wpc="http://schemas.microsoft.com/office/word/2010/wordprocessingCanvas" xmlns:cx="http://schemas.microsoft.com/office/drawing/2014/chartex" xmlns:cx1="http://schemas.microsoft.com/office/drawing/2015/9/8/chartex" xmlns:cx2="http://schemas.microsoft.com/office/drawing/2015/10/21/chartex" xmlns:cx3="http://schemas.microsoft.com/office/drawing/2016/5/9/chartex" xmlns:cx4="http://schemas.microsoft.com/office/drawing/2016/5/10/chartex" xmlns:cx5="http://schemas.microsoft.com/office/drawing/2016/5/11/chartex" xmlns:cx6="http://schemas.microsoft.com/office/drawing/2016/5/12/chartex" xmlns:cx7="http://schemas.microsoft.com/office/drawing/2016/5/13/chartex" xmlns:cx8="http://schemas.microsoft.com/office/drawing/2016/5/14/chartex" xmlns:mc="http://schemas.openxmlformats.org/markup-compatibility/2006" xmlns:aink="http://schemas.microsoft.com/office/drawing/2016/ink" xmlns:am3d="http://schemas.microsoft.com/office/drawing/2017/model3d" xmlns:o="urn:schemas-microsoft-com:office:office" xmlns:oel="http://schemas.microsoft.com/office/2019/extlst" xmlns:r="http://schemas.openxmlformats.org/officeDocument/2006/relationships" xmlns:m="http://schemas.openxmlformats.org/officeDocument/2006/math" xmlns:v="urn:schemas-microsoft-com:vml" xmlns:wp14="http://schemas.microsoft.com/office/word/2010/wordprocessingDrawing" xmlns:wp="http://schemas.openxmlformats.org/drawingml/2006/wordprocessingDrawing" xmlns:w10="urn:schemas-microsoft-com:office:word" xmlns:w="http://schemas.openxmlformats.org/wordprocessingml/2006/main" xmlns:w14="http://schemas.microsoft.com/office/word/2010/wordml" xmlns:w15="http://schemas.microsoft.com/office/word/2012/wordml" xmlns:w16cex="http://schemas.microsoft.com/office/word/2018/wordml/cex" xmlns:w16cid="http://schemas.microsoft.com/office/word/2016/wordml/cid" xmlns:w16="http://schemas.microsoft.com/office/word/2018/wordml" xmlns:w16du="http://schemas.microsoft.com/office/word/2023/wordml/word16du" xmlns:w16sdtdh="http://schemas.microsoft.com/office/word/2020/wordml/sdtdatahash" xmlns:w16sdtfl="http://schemas.microsoft.com/office/word/2024/wordml/sdtformatlock" xmlns:w16se="http://schemas.microsoft.com/office/word/2015/wordml/symex" xmlns:wpg="http://schemas.microsoft.com/office/word/2010/wordprocessingGroup" xmlns:wpi="http://schemas.microsoft.com/office/word/2010/wordprocessingInk" xmlns:wne="http://schemas.microsoft.com/office/word/2006/wordml" xmlns:wps="http://schemas.microsoft.com/office/word/2010/wordprocessingShape" mc:Ignorable="w14 w15 w16se w16cid w16 w16cex w16sdtdh w16sdtfl w16du wp14">
   <w:p>
     <w:pPr>
-      <w:pStyle w:val="a9"/>
+      <w:pStyle w:val="Header"/>
     </w:pPr>
   </w:p>
 </w:hdr>
@@ -7143,7 +8196,7 @@
 <w:hdr xmlns:wpc="http://schemas.microsoft.com/office/word/2010/wordprocessingCanvas" xmlns:cx="http://schemas.microsoft.com/office/drawing/2014/chartex" xmlns:cx1="http://schemas.microsoft.com/office/drawing/2015/9/8/chartex" xmlns:cx2="http://schemas.microsoft.com/office/drawing/2015/10/21/chartex" xmlns:cx3="http://schemas.microsoft.com/office/drawing/2016/5/9/chartex" xmlns:cx4="http://schemas.microsoft.com/office/drawing/2016/5/10/chartex" xmlns:cx5="http://schemas.microsoft.com/office/drawing/2016/5/11/chartex" xmlns:cx6="http://schemas.microsoft.com/office/drawing/2016/5/12/chartex" xmlns:cx7="http://schemas.microsoft.com/office/drawing/2016/5/13/chartex" xmlns:cx8="http://schemas.microsoft.com/office/drawing/2016/5/14/chartex" xmlns:mc="http://schemas.openxmlformats.org/markup-compatibility/2006" xmlns:aink="http://schemas.microsoft.com/office/drawing/2016/ink" xmlns:am3d="http://schemas.microsoft.com/office/drawing/2017/model3d" xmlns:o="urn:schemas-microsoft-com:office:office" xmlns:oel="http://schemas.microsoft.com/office/2019/extlst" xmlns:r="http://schemas.openxmlformats.org/officeDocument/2006/relationships" xmlns:m="http://schemas.openxmlformats.org/officeDocument/2006/math" xmlns:v="urn:schemas-microsoft-com:vml" xmlns:wp14="http://schemas.microsoft.com/office/word/2010/wordprocessingDrawing" xmlns:wp="http://schemas.openxmlformats.org/drawingml/2006/wordprocessingDrawing" xmlns:w10="urn:schemas-microsoft-com:office:word" xmlns:w="http://schemas.openxmlformats.org/wordprocessingml/2006/main" xmlns:w14="http://schemas.microsoft.com/office/word/2010/wordml" xmlns:w15="http://schemas.microsoft.com/office/word/2012/wordml" xmlns:w16cex="http://schemas.microsoft.com/office/word/2018/wordml/cex" xmlns:w16cid="http://schemas.microsoft.com/office/word/2016/wordml/cid" xmlns:w16="http://schemas.microsoft.com/office/word/2018/wordml" xmlns:w16du="http://schemas.microsoft.com/office/word/2023/wordml/word16du" xmlns:w16sdtdh="http://schemas.microsoft.com/office/word/2020/wordml/sdtdatahash" xmlns:w16sdtfl="http://schemas.microsoft.com/office/word/2024/wordml/sdtformatlock" xmlns:w16se="http://schemas.microsoft.com/office/word/2015/wordml/symex" xmlns:wpg="http://schemas.microsoft.com/office/word/2010/wordprocessingGroup" xmlns:wpi="http://schemas.microsoft.com/office/word/2010/wordprocessingInk" xmlns:wne="http://schemas.microsoft.com/office/word/2006/wordml" xmlns:wps="http://schemas.microsoft.com/office/word/2010/wordprocessingShape" mc:Ignorable="w14 w15 w16se w16cid w16 w16cex w16sdtdh w16sdtfl w16du wp14">
   <w:p>
     <w:pPr>
-      <w:pStyle w:val="a9"/>
+      <w:pStyle w:val="Header"/>
     </w:pPr>
     <w:r>
       <w:rPr>
@@ -7171,7 +8224,7 @@
 <w:hdr xmlns:wpc="http://schemas.microsoft.com/office/word/2010/wordprocessingCanvas" xmlns:cx="http://schemas.microsoft.com/office/drawing/2014/chartex" xmlns:cx1="http://schemas.microsoft.com/office/drawing/2015/9/8/chartex" xmlns:cx2="http://schemas.microsoft.com/office/drawing/2015/10/21/chartex" xmlns:cx3="http://schemas.microsoft.com/office/drawing/2016/5/9/chartex" xmlns:cx4="http://schemas.microsoft.com/office/drawing/2016/5/10/chartex" xmlns:cx5="http://schemas.microsoft.com/office/drawing/2016/5/11/chartex" xmlns:cx6="http://schemas.microsoft.com/office/drawing/2016/5/12/chartex" xmlns:cx7="http://schemas.microsoft.com/office/drawing/2016/5/13/chartex" xmlns:cx8="http://schemas.microsoft.com/office/drawing/2016/5/14/chartex" xmlns:mc="http://schemas.openxmlformats.org/markup-compatibility/2006" xmlns:aink="http://schemas.microsoft.com/office/drawing/2016/ink" xmlns:am3d="http://schemas.microsoft.com/office/drawing/2017/model3d" xmlns:o="urn:schemas-microsoft-com:office:office" xmlns:oel="http://schemas.microsoft.com/office/2019/extlst" xmlns:r="http://schemas.openxmlformats.org/officeDocument/2006/relationships" xmlns:m="http://schemas.openxmlformats.org/officeDocument/2006/math" xmlns:v="urn:schemas-microsoft-com:vml" xmlns:wp14="http://schemas.microsoft.com/office/word/2010/wordprocessingDrawing" xmlns:wp="http://schemas.openxmlformats.org/drawingml/2006/wordprocessingDrawing" xmlns:w10="urn:schemas-microsoft-com:office:word" xmlns:w="http://schemas.openxmlformats.org/wordprocessingml/2006/main" xmlns:w14="http://schemas.microsoft.com/office/word/2010/wordml" xmlns:w15="http://schemas.microsoft.com/office/word/2012/wordml" xmlns:w16cex="http://schemas.microsoft.com/office/word/2018/wordml/cex" xmlns:w16cid="http://schemas.microsoft.com/office/word/2016/wordml/cid" xmlns:w16="http://schemas.microsoft.com/office/word/2018/wordml" xmlns:w16du="http://schemas.microsoft.com/office/word/2023/wordml/word16du" xmlns:w16sdtdh="http://schemas.microsoft.com/office/word/2020/wordml/sdtdatahash" xmlns:w16sdtfl="http://schemas.microsoft.com/office/word/2024/wordml/sdtformatlock" xmlns:w16se="http://schemas.microsoft.com/office/word/2015/wordml/symex" xmlns:wpg="http://schemas.microsoft.com/office/word/2010/wordprocessingGroup" xmlns:wpi="http://schemas.microsoft.com/office/word/2010/wordprocessingInk" xmlns:wne="http://schemas.microsoft.com/office/word/2006/wordml" xmlns:wps="http://schemas.microsoft.com/office/word/2010/wordprocessingShape" mc:Ignorable="w14 w15 w16se w16cid w16 w16cex w16sdtdh w16sdtfl w16du wp14">
   <w:p>
     <w:pPr>
-      <w:pStyle w:val="a9"/>
+      <w:pStyle w:val="Header"/>
     </w:pPr>
   </w:p>
 </w:hdr>
@@ -7662,7 +8715,7 @@
     <w:lvl w:ilvl="0">
       <w:start w:val="1"/>
       <w:numFmt w:val="decimal"/>
-      <w:pStyle w:val="4"/>
+      <w:pStyle w:val="Heading4"/>
       <w:lvlText w:val="%1)"/>
       <w:lvlJc w:val="left"/>
       <w:pPr>
@@ -7819,7 +8872,7 @@
   <w:docDefaults>
     <w:rPrDefault>
       <w:rPr>
-        <w:rFonts w:ascii="Calibri" w:eastAsia="宋体" w:hAnsi="Calibri" w:cs="Calibri"/>
+        <w:rFonts w:ascii="Calibri" w:eastAsia="SimSun" w:hAnsi="Calibri" w:cs="Calibri"/>
         <w:lang w:val="en-US" w:eastAsia="zh-CN" w:bidi="ar-SA"/>
       </w:rPr>
     </w:rPrDefault>
@@ -8200,7 +9253,7 @@
     <w:lsdException w:name="Unresolved Mention" w:semiHidden="1" w:unhideWhenUsed="1"/>
     <w:lsdException w:name="Smart Link" w:semiHidden="1" w:unhideWhenUsed="1"/>
   </w:latentStyles>
-  <w:style w:type="paragraph" w:default="1" w:styleId="a">
+  <w:style w:type="paragraph" w:default="1" w:styleId="Normal">
     <w:name w:val="Normal"/>
     <w:qFormat/>
     <w:pPr>
@@ -8216,11 +9269,11 @@
       <w:szCs w:val="21"/>
     </w:rPr>
   </w:style>
-  <w:style w:type="paragraph" w:styleId="1">
+  <w:style w:type="paragraph" w:styleId="Heading1">
     <w:name w:val="heading 1"/>
-    <w:basedOn w:val="a"/>
-    <w:next w:val="a"/>
-    <w:link w:val="10"/>
+    <w:basedOn w:val="Normal"/>
+    <w:next w:val="Normal"/>
+    <w:link w:val="Heading1Char"/>
     <w:qFormat/>
     <w:pPr>
       <w:keepNext/>
@@ -8238,11 +9291,11 @@
       <w:szCs w:val="44"/>
     </w:rPr>
   </w:style>
-  <w:style w:type="paragraph" w:styleId="2">
+  <w:style w:type="paragraph" w:styleId="Heading2">
     <w:name w:val="heading 2"/>
-    <w:basedOn w:val="1"/>
-    <w:next w:val="a"/>
-    <w:link w:val="20"/>
+    <w:basedOn w:val="Heading1"/>
+    <w:next w:val="Normal"/>
+    <w:link w:val="Heading2Char"/>
     <w:qFormat/>
     <w:pPr>
       <w:numPr>
@@ -8257,11 +9310,11 @@
       <w:sz w:val="30"/>
     </w:rPr>
   </w:style>
-  <w:style w:type="paragraph" w:styleId="3">
+  <w:style w:type="paragraph" w:styleId="Heading3">
     <w:name w:val="heading 3"/>
-    <w:basedOn w:val="2"/>
-    <w:next w:val="a"/>
-    <w:link w:val="30"/>
+    <w:basedOn w:val="Heading2"/>
+    <w:next w:val="Normal"/>
+    <w:link w:val="Heading3Char"/>
     <w:qFormat/>
     <w:pPr>
       <w:spacing w:beforeLines="50" w:before="120" w:afterLines="0"/>
@@ -8275,11 +9328,11 @@
       <w:szCs w:val="24"/>
     </w:rPr>
   </w:style>
-  <w:style w:type="paragraph" w:styleId="4">
+  <w:style w:type="paragraph" w:styleId="Heading4">
     <w:name w:val="heading 4"/>
-    <w:basedOn w:val="3"/>
-    <w:next w:val="a"/>
-    <w:link w:val="40"/>
+    <w:basedOn w:val="Heading3"/>
+    <w:next w:val="Normal"/>
+    <w:link w:val="Heading4Char"/>
     <w:qFormat/>
     <w:pPr>
       <w:numPr>
@@ -8293,11 +9346,11 @@
       <w:sz w:val="24"/>
     </w:rPr>
   </w:style>
-  <w:style w:type="paragraph" w:styleId="8">
+  <w:style w:type="paragraph" w:styleId="Heading8">
     <w:name w:val="heading 8"/>
-    <w:basedOn w:val="a"/>
-    <w:next w:val="a"/>
-    <w:link w:val="80"/>
+    <w:basedOn w:val="Normal"/>
+    <w:next w:val="Normal"/>
+    <w:link w:val="Heading8Char"/>
     <w:qFormat/>
     <w:pPr>
       <w:keepNext/>
@@ -8310,17 +9363,17 @@
       <w:outlineLvl w:val="7"/>
     </w:pPr>
     <w:rPr>
-      <w:rFonts w:ascii="Arial" w:eastAsia="黑体" w:hAnsi="Arial"/>
+      <w:rFonts w:ascii="Arial" w:eastAsia="SimHei" w:hAnsi="Arial"/>
       <w:szCs w:val="24"/>
     </w:rPr>
   </w:style>
-  <w:style w:type="character" w:default="1" w:styleId="a0">
+  <w:style w:type="character" w:default="1" w:styleId="DefaultParagraphFont">
     <w:name w:val="Default Paragraph Font"/>
     <w:uiPriority w:val="1"/>
     <w:semiHidden/>
     <w:unhideWhenUsed/>
   </w:style>
-  <w:style w:type="table" w:default="1" w:styleId="a1">
+  <w:style w:type="table" w:default="1" w:styleId="TableNormal">
     <w:name w:val="Normal Table"/>
     <w:uiPriority w:val="99"/>
     <w:semiHidden/>
@@ -8335,16 +9388,16 @@
       </w:tblCellMar>
     </w:tblPr>
   </w:style>
-  <w:style w:type="numbering" w:default="1" w:styleId="a2">
+  <w:style w:type="numbering" w:default="1" w:styleId="NoList">
     <w:name w:val="No List"/>
     <w:uiPriority w:val="99"/>
     <w:semiHidden/>
     <w:unhideWhenUsed/>
   </w:style>
-  <w:style w:type="paragraph" w:styleId="a3">
+  <w:style w:type="paragraph" w:styleId="CommentText">
     <w:name w:val="annotation text"/>
-    <w:basedOn w:val="a"/>
-    <w:link w:val="a4"/>
+    <w:basedOn w:val="Normal"/>
+    <w:link w:val="CommentTextChar"/>
     <w:qFormat/>
     <w:pPr>
       <w:spacing w:line="240" w:lineRule="auto"/>
@@ -8356,10 +9409,10 @@
       <w:szCs w:val="24"/>
     </w:rPr>
   </w:style>
-  <w:style w:type="paragraph" w:styleId="a5">
+  <w:style w:type="paragraph" w:styleId="BalloonText">
     <w:name w:val="Balloon Text"/>
-    <w:basedOn w:val="a"/>
-    <w:link w:val="a6"/>
+    <w:basedOn w:val="Normal"/>
+    <w:link w:val="BalloonTextChar"/>
     <w:uiPriority w:val="99"/>
     <w:semiHidden/>
     <w:unhideWhenUsed/>
@@ -8371,10 +9424,10 @@
       <w:szCs w:val="18"/>
     </w:rPr>
   </w:style>
-  <w:style w:type="paragraph" w:styleId="a7">
+  <w:style w:type="paragraph" w:styleId="Footer">
     <w:name w:val="footer"/>
-    <w:basedOn w:val="a"/>
-    <w:link w:val="a8"/>
+    <w:basedOn w:val="Normal"/>
+    <w:link w:val="FooterChar"/>
     <w:uiPriority w:val="99"/>
     <w:unhideWhenUsed/>
     <w:qFormat/>
@@ -8392,10 +9445,10 @@
       <w:szCs w:val="18"/>
     </w:rPr>
   </w:style>
-  <w:style w:type="paragraph" w:styleId="a9">
+  <w:style w:type="paragraph" w:styleId="Header">
     <w:name w:val="header"/>
-    <w:basedOn w:val="a"/>
-    <w:link w:val="aa"/>
+    <w:basedOn w:val="Normal"/>
+    <w:link w:val="HeaderChar"/>
     <w:uiPriority w:val="99"/>
     <w:qFormat/>
     <w:pPr>
@@ -8416,9 +9469,9 @@
       <w:sz w:val="21"/>
     </w:rPr>
   </w:style>
-  <w:style w:type="paragraph" w:styleId="ab">
+  <w:style w:type="paragraph" w:styleId="NormalWeb">
     <w:name w:val="Normal (Web)"/>
-    <w:basedOn w:val="a"/>
+    <w:basedOn w:val="Normal"/>
     <w:uiPriority w:val="99"/>
     <w:semiHidden/>
     <w:unhideWhenUsed/>
@@ -8430,14 +9483,14 @@
       <w:jc w:val="left"/>
     </w:pPr>
     <w:rPr>
-      <w:rFonts w:ascii="宋体" w:hAnsi="宋体" w:cs="宋体"/>
+      <w:rFonts w:ascii="SimSun" w:hAnsi="SimSun" w:cs="SimSun"/>
       <w:kern w:val="0"/>
       <w:szCs w:val="24"/>
     </w:rPr>
   </w:style>
-  <w:style w:type="table" w:styleId="ac">
+  <w:style w:type="table" w:styleId="TableGrid">
     <w:name w:val="Table Grid"/>
-    <w:basedOn w:val="a1"/>
+    <w:basedOn w:val="TableNormal"/>
     <w:uiPriority w:val="59"/>
     <w:qFormat/>
     <w:pPr>
@@ -8458,9 +9511,9 @@
       </w:tblBorders>
     </w:tblPr>
   </w:style>
-  <w:style w:type="character" w:styleId="ad">
+  <w:style w:type="character" w:styleId="FollowedHyperlink">
     <w:name w:val="FollowedHyperlink"/>
-    <w:basedOn w:val="a0"/>
+    <w:basedOn w:val="DefaultParagraphFont"/>
     <w:uiPriority w:val="99"/>
     <w:semiHidden/>
     <w:unhideWhenUsed/>
@@ -8470,9 +9523,9 @@
       <w:u w:val="single"/>
     </w:rPr>
   </w:style>
-  <w:style w:type="character" w:styleId="ae">
+  <w:style w:type="character" w:styleId="Hyperlink">
     <w:name w:val="Hyperlink"/>
-    <w:basedOn w:val="a0"/>
+    <w:basedOn w:val="DefaultParagraphFont"/>
     <w:uiPriority w:val="99"/>
     <w:unhideWhenUsed/>
     <w:qFormat/>
@@ -8481,26 +9534,26 @@
       <w:u w:val="single"/>
     </w:rPr>
   </w:style>
-  <w:style w:type="character" w:styleId="HTML">
+  <w:style w:type="character" w:styleId="HTMLCode">
     <w:name w:val="HTML Code"/>
-    <w:basedOn w:val="a0"/>
+    <w:basedOn w:val="DefaultParagraphFont"/>
     <w:uiPriority w:val="99"/>
     <w:semiHidden/>
     <w:unhideWhenUsed/>
     <w:qFormat/>
     <w:rPr>
-      <w:rFonts w:ascii="宋体" w:eastAsia="宋体" w:hAnsi="宋体" w:cs="宋体"/>
+      <w:rFonts w:ascii="SimSun" w:eastAsia="SimSun" w:hAnsi="SimSun" w:cs="SimSun"/>
       <w:sz w:val="24"/>
       <w:szCs w:val="24"/>
     </w:rPr>
   </w:style>
-  <w:style w:type="character" w:customStyle="1" w:styleId="10">
-    <w:name w:val="标题 1 字符"/>
-    <w:basedOn w:val="a0"/>
-    <w:link w:val="1"/>
+  <w:style w:type="character" w:customStyle="1" w:styleId="Heading1Char">
+    <w:name w:val="Heading 1 Char"/>
+    <w:basedOn w:val="DefaultParagraphFont"/>
+    <w:link w:val="Heading1"/>
     <w:qFormat/>
     <w:rPr>
-      <w:rFonts w:ascii="Times New Roman" w:eastAsia="宋体" w:hAnsi="Times New Roman" w:cs="Times New Roman"/>
+      <w:rFonts w:ascii="Times New Roman" w:eastAsia="SimSun" w:hAnsi="Times New Roman" w:cs="Times New Roman"/>
       <w:bCs/>
       <w:snapToGrid w:val="0"/>
       <w:kern w:val="44"/>
@@ -8508,26 +9561,26 @@
       <w:szCs w:val="44"/>
     </w:rPr>
   </w:style>
-  <w:style w:type="character" w:customStyle="1" w:styleId="20">
-    <w:name w:val="标题 2 字符"/>
-    <w:basedOn w:val="a0"/>
-    <w:link w:val="2"/>
+  <w:style w:type="character" w:customStyle="1" w:styleId="Heading2Char">
+    <w:name w:val="Heading 2 Char"/>
+    <w:basedOn w:val="DefaultParagraphFont"/>
+    <w:link w:val="Heading2"/>
     <w:qFormat/>
     <w:rPr>
-      <w:rFonts w:ascii="Times New Roman" w:eastAsia="宋体" w:hAnsi="Times New Roman" w:cs="Times New Roman"/>
+      <w:rFonts w:ascii="Times New Roman" w:eastAsia="SimSun" w:hAnsi="Times New Roman" w:cs="Times New Roman"/>
       <w:snapToGrid w:val="0"/>
       <w:kern w:val="44"/>
       <w:sz w:val="30"/>
       <w:szCs w:val="44"/>
     </w:rPr>
   </w:style>
-  <w:style w:type="character" w:customStyle="1" w:styleId="30">
-    <w:name w:val="标题 3 字符"/>
-    <w:basedOn w:val="a0"/>
-    <w:link w:val="3"/>
+  <w:style w:type="character" w:customStyle="1" w:styleId="Heading3Char">
+    <w:name w:val="Heading 3 Char"/>
+    <w:basedOn w:val="DefaultParagraphFont"/>
+    <w:link w:val="Heading3"/>
     <w:qFormat/>
     <w:rPr>
-      <w:rFonts w:ascii="Times New Roman" w:eastAsia="宋体" w:hAnsi="Times New Roman" w:cs="Times New Roman"/>
+      <w:rFonts w:ascii="Times New Roman" w:eastAsia="SimSun" w:hAnsi="Times New Roman" w:cs="Times New Roman"/>
       <w:bCs/>
       <w:snapToGrid w:val="0"/>
       <w:color w:val="333333"/>
@@ -8536,13 +9589,13 @@
       <w:szCs w:val="24"/>
     </w:rPr>
   </w:style>
-  <w:style w:type="character" w:customStyle="1" w:styleId="40">
-    <w:name w:val="标题 4 字符"/>
-    <w:basedOn w:val="a0"/>
-    <w:link w:val="4"/>
+  <w:style w:type="character" w:customStyle="1" w:styleId="Heading4Char">
+    <w:name w:val="Heading 4 Char"/>
+    <w:basedOn w:val="DefaultParagraphFont"/>
+    <w:link w:val="Heading4"/>
     <w:qFormat/>
     <w:rPr>
-      <w:rFonts w:ascii="Times New Roman" w:eastAsia="宋体" w:hAnsi="Times New Roman" w:cs="Times New Roman"/>
+      <w:rFonts w:ascii="Times New Roman" w:eastAsia="SimSun" w:hAnsi="Times New Roman" w:cs="Times New Roman"/>
       <w:bCs/>
       <w:snapToGrid w:val="0"/>
       <w:color w:val="333333"/>
@@ -8551,44 +9604,44 @@
       <w:szCs w:val="24"/>
     </w:rPr>
   </w:style>
-  <w:style w:type="character" w:customStyle="1" w:styleId="80">
-    <w:name w:val="标题 8 字符"/>
-    <w:basedOn w:val="a0"/>
-    <w:link w:val="8"/>
+  <w:style w:type="character" w:customStyle="1" w:styleId="Heading8Char">
+    <w:name w:val="Heading 8 Char"/>
+    <w:basedOn w:val="DefaultParagraphFont"/>
+    <w:link w:val="Heading8"/>
     <w:qFormat/>
     <w:rPr>
-      <w:rFonts w:ascii="Arial" w:eastAsia="黑体" w:hAnsi="Arial" w:cs="Times New Roman"/>
+      <w:rFonts w:ascii="Arial" w:eastAsia="SimHei" w:hAnsi="Arial" w:cs="Times New Roman"/>
       <w:sz w:val="24"/>
       <w:szCs w:val="24"/>
     </w:rPr>
   </w:style>
-  <w:style w:type="character" w:customStyle="1" w:styleId="a4">
-    <w:name w:val="批注文字 字符"/>
-    <w:basedOn w:val="a0"/>
-    <w:link w:val="a3"/>
+  <w:style w:type="character" w:customStyle="1" w:styleId="CommentTextChar">
+    <w:name w:val="Comment Text Char"/>
+    <w:basedOn w:val="DefaultParagraphFont"/>
+    <w:link w:val="CommentText"/>
     <w:qFormat/>
     <w:rPr>
-      <w:rFonts w:ascii="Times New Roman" w:eastAsia="宋体" w:hAnsi="Times New Roman" w:cs="Times New Roman"/>
+      <w:rFonts w:ascii="Times New Roman" w:eastAsia="SimSun" w:hAnsi="Times New Roman" w:cs="Times New Roman"/>
       <w:szCs w:val="24"/>
     </w:rPr>
   </w:style>
-  <w:style w:type="character" w:customStyle="1" w:styleId="aa">
-    <w:name w:val="页眉 字符"/>
-    <w:basedOn w:val="a0"/>
-    <w:link w:val="a9"/>
+  <w:style w:type="character" w:customStyle="1" w:styleId="HeaderChar">
+    <w:name w:val="Header Char"/>
+    <w:basedOn w:val="DefaultParagraphFont"/>
+    <w:link w:val="Header"/>
     <w:uiPriority w:val="99"/>
     <w:qFormat/>
     <w:rPr>
-      <w:rFonts w:ascii="Times New Roman" w:eastAsia="宋体" w:hAnsi="Times New Roman" w:cs="Times New Roman"/>
+      <w:rFonts w:ascii="Times New Roman" w:eastAsia="SimSun" w:hAnsi="Times New Roman" w:cs="Times New Roman"/>
       <w:snapToGrid w:val="0"/>
       <w:kern w:val="24"/>
       <w:szCs w:val="21"/>
     </w:rPr>
   </w:style>
-  <w:style w:type="paragraph" w:customStyle="1" w:styleId="af">
+  <w:style w:type="paragraph" w:customStyle="1" w:styleId="a">
     <w:name w:val="图表题注"/>
-    <w:basedOn w:val="a"/>
-    <w:next w:val="a"/>
+    <w:basedOn w:val="Normal"/>
+    <w:next w:val="Normal"/>
     <w:qFormat/>
     <w:pPr>
       <w:spacing w:beforeLines="50" w:afterLines="50"/>
@@ -8599,42 +9652,42 @@
       <w:sz w:val="21"/>
     </w:rPr>
   </w:style>
-  <w:style w:type="paragraph" w:styleId="af0">
+  <w:style w:type="paragraph" w:styleId="ListParagraph">
     <w:name w:val="List Paragraph"/>
-    <w:basedOn w:val="a"/>
+    <w:basedOn w:val="Normal"/>
     <w:uiPriority w:val="34"/>
     <w:qFormat/>
     <w:pPr>
       <w:ind w:firstLine="420"/>
     </w:pPr>
   </w:style>
-  <w:style w:type="character" w:customStyle="1" w:styleId="a6">
-    <w:name w:val="批注框文本 字符"/>
-    <w:basedOn w:val="a0"/>
-    <w:link w:val="a5"/>
+  <w:style w:type="character" w:customStyle="1" w:styleId="BalloonTextChar">
+    <w:name w:val="Balloon Text Char"/>
+    <w:basedOn w:val="DefaultParagraphFont"/>
+    <w:link w:val="BalloonText"/>
     <w:uiPriority w:val="99"/>
     <w:semiHidden/>
     <w:rPr>
-      <w:rFonts w:ascii="Times New Roman" w:eastAsia="宋体" w:hAnsi="Times New Roman" w:cs="Times New Roman"/>
+      <w:rFonts w:ascii="Times New Roman" w:eastAsia="SimSun" w:hAnsi="Times New Roman" w:cs="Times New Roman"/>
       <w:sz w:val="18"/>
       <w:szCs w:val="18"/>
     </w:rPr>
   </w:style>
-  <w:style w:type="character" w:customStyle="1" w:styleId="a8">
-    <w:name w:val="页脚 字符"/>
-    <w:basedOn w:val="a0"/>
-    <w:link w:val="a7"/>
+  <w:style w:type="character" w:customStyle="1" w:styleId="FooterChar">
+    <w:name w:val="Footer Char"/>
+    <w:basedOn w:val="DefaultParagraphFont"/>
+    <w:link w:val="Footer"/>
     <w:uiPriority w:val="99"/>
     <w:qFormat/>
     <w:rPr>
-      <w:rFonts w:ascii="Times New Roman" w:eastAsia="宋体" w:hAnsi="Times New Roman" w:cs="Times New Roman"/>
+      <w:rFonts w:ascii="Times New Roman" w:eastAsia="SimSun" w:hAnsi="Times New Roman" w:cs="Times New Roman"/>
       <w:sz w:val="18"/>
       <w:szCs w:val="18"/>
     </w:rPr>
   </w:style>
   <w:style w:type="paragraph" w:customStyle="1" w:styleId="msonormal0">
     <w:name w:val="msonormal"/>
-    <w:basedOn w:val="a"/>
+    <w:basedOn w:val="Normal"/>
     <w:rsid w:val="00A80471"/>
     <w:pPr>
       <w:widowControl/>
@@ -8643,15 +9696,15 @@
       <w:jc w:val="left"/>
     </w:pPr>
     <w:rPr>
-      <w:rFonts w:ascii="宋体" w:hAnsi="宋体" w:cs="宋体"/>
+      <w:rFonts w:ascii="SimSun" w:hAnsi="SimSun" w:cs="SimSun"/>
       <w:kern w:val="0"/>
       <w:szCs w:val="24"/>
     </w:rPr>
   </w:style>
-  <w:style w:type="paragraph" w:styleId="af1">
+  <w:style w:type="paragraph" w:styleId="FootnoteText">
     <w:name w:val="footnote text"/>
-    <w:basedOn w:val="a"/>
-    <w:link w:val="af2"/>
+    <w:basedOn w:val="Normal"/>
+    <w:link w:val="FootnoteTextChar"/>
     <w:uiPriority w:val="99"/>
     <w:semiHidden/>
     <w:unhideWhenUsed/>
@@ -8666,10 +9719,10 @@
       <w:szCs w:val="18"/>
     </w:rPr>
   </w:style>
-  <w:style w:type="character" w:customStyle="1" w:styleId="af2">
-    <w:name w:val="脚注文本 字符"/>
-    <w:basedOn w:val="a0"/>
-    <w:link w:val="af1"/>
+  <w:style w:type="character" w:customStyle="1" w:styleId="FootnoteTextChar">
+    <w:name w:val="Footnote Text Char"/>
+    <w:basedOn w:val="DefaultParagraphFont"/>
+    <w:link w:val="FootnoteText"/>
     <w:uiPriority w:val="99"/>
     <w:semiHidden/>
     <w:qFormat/>
@@ -8681,9 +9734,9 @@
       <w:szCs w:val="18"/>
     </w:rPr>
   </w:style>
-  <w:style w:type="character" w:styleId="af3">
+  <w:style w:type="character" w:styleId="FootnoteReference">
     <w:name w:val="footnote reference"/>
-    <w:basedOn w:val="a0"/>
+    <w:basedOn w:val="DefaultParagraphFont"/>
     <w:uiPriority w:val="99"/>
     <w:semiHidden/>
     <w:unhideWhenUsed/>
@@ -8693,9 +9746,9 @@
       <w:vertAlign w:val="superscript"/>
     </w:rPr>
   </w:style>
-  <w:style w:type="character" w:styleId="af4">
+  <w:style w:type="character" w:styleId="UnresolvedMention">
     <w:name w:val="Unresolved Mention"/>
-    <w:basedOn w:val="a0"/>
+    <w:basedOn w:val="DefaultParagraphFont"/>
     <w:uiPriority w:val="99"/>
     <w:semiHidden/>
     <w:unhideWhenUsed/>

</xml_diff>